<commit_message>
update 4 and 6
</commit_message>
<xml_diff>
--- a/6.docx
+++ b/6.docx
@@ -96,12 +96,6 @@
         <w:gridCol w:w="7360"/>
       </w:tblGrid>
       <w:tr>
-        <w:tblPrEx>
-          <w:tblCellMar>
-            <w:top w:w="0" w:type="dxa"/>
-            <w:bottom w:w="0" w:type="dxa"/>
-          </w:tblCellMar>
-        </w:tblPrEx>
         <w:trPr>
           <w:tblHeader/>
         </w:trPr>
@@ -181,12 +175,6 @@
         </w:tc>
       </w:tr>
       <w:tr>
-        <w:tblPrEx>
-          <w:tblCellMar>
-            <w:top w:w="0" w:type="dxa"/>
-            <w:bottom w:w="0" w:type="dxa"/>
-          </w:tblCellMar>
-        </w:tblPrEx>
         <w:tc>
           <w:tcPr>
             <w:tcW w:w="2000" w:type="dxa"/>
@@ -257,12 +245,6 @@
         </w:tc>
       </w:tr>
       <w:tr>
-        <w:tblPrEx>
-          <w:tblCellMar>
-            <w:top w:w="0" w:type="dxa"/>
-            <w:bottom w:w="0" w:type="dxa"/>
-          </w:tblCellMar>
-        </w:tblPrEx>
         <w:tc>
           <w:tcPr>
             <w:tcW w:w="2000" w:type="dxa"/>
@@ -333,12 +315,6 @@
         </w:tc>
       </w:tr>
       <w:tr>
-        <w:tblPrEx>
-          <w:tblCellMar>
-            <w:top w:w="0" w:type="dxa"/>
-            <w:bottom w:w="0" w:type="dxa"/>
-          </w:tblCellMar>
-        </w:tblPrEx>
         <w:tc>
           <w:tcPr>
             <w:tcW w:w="2000" w:type="dxa"/>
@@ -524,6 +500,7 @@
           <w:szCs w:val="22"/>
         </w:rPr>
       </w:pPr>
+      <w:bookmarkStart w:id="0" w:name="OLE_LINK2"/>
       <w:r>
         <w:rPr>
           <w:rFonts w:ascii="Times New Roman" w:eastAsia="Arial" w:hAnsi="Times New Roman" w:cs="Times New Roman"/>
@@ -533,6 +510,7 @@
         <w:t>The team conducted user interviews to validate three personas (Student, Professional, Tourist), produced Figma UI mockups, and defined user stories. On the technical side, a MySQL database schema was established and scraping scripts for the JCDecaux and OpenWeatherMap APIs were written and deployed. A 5-minute scrape interval was chosen as the design default to balance data freshness against API rate limits. The scraper ran stably throughout the sprint, consistently populating the database and providing a reliable foundation for subsequent development.</w:t>
       </w:r>
     </w:p>
+    <w:bookmarkEnd w:id="0"/>
     <w:p>
       <w:pPr>
         <w:rPr>
@@ -560,7 +538,7 @@
       <w:pPr>
         <w:pStyle w:val="Heading3"/>
         <w:rPr>
-          <w:rFonts w:ascii="Times New Roman" w:hAnsi="Times New Roman" w:cs="Times New Roman" w:hint="eastAsia"/>
+          <w:rFonts w:ascii="Times New Roman" w:hAnsi="Times New Roman" w:cs="Times New Roman"/>
         </w:rPr>
       </w:pPr>
       <w:r>
@@ -622,20 +600,24 @@
     </w:p>
     <w:p>
       <w:pPr>
-        <w:spacing w:before="60" w:after="60"/>
-        <w:rPr>
-          <w:rFonts w:ascii="Times New Roman" w:hAnsi="Times New Roman" w:cs="Times New Roman"/>
-          <w:sz w:val="22"/>
-          <w:szCs w:val="22"/>
-        </w:rPr>
-      </w:pPr>
-      <w:r>
-        <w:rPr>
-          <w:rFonts w:ascii="Times New Roman" w:eastAsia="Arial" w:hAnsi="Times New Roman" w:cs="Times New Roman"/>
-          <w:sz w:val="22"/>
-          <w:szCs w:val="22"/>
-        </w:rPr>
-        <w:t>The Actual Remaining Effort line crossed below the Ideal Trend line on Day 4 and reached zero two days before the deadline, indicating the team worked ahead of schedule. The surplus time was used for backlog refinement and feasibility research on the Smart Journey Planner feature.</w:t>
+        <w:spacing w:before="240" w:after="240"/>
+        <w:rPr>
+          <w:rFonts w:ascii="Times New Roman" w:hAnsi="Times New Roman" w:cs="Times New Roman"/>
+          <w:color w:val="1F1F1F"/>
+          <w:sz w:val="22"/>
+          <w:szCs w:val="22"/>
+          <w:highlight w:val="white"/>
+        </w:rPr>
+      </w:pPr>
+      <w:r>
+        <w:rPr>
+          <w:rFonts w:ascii="Times New Roman" w:hAnsi="Times New Roman" w:cs="Times New Roman"/>
+          <w:color w:val="1F1F1F"/>
+          <w:sz w:val="22"/>
+          <w:szCs w:val="22"/>
+          <w:highlight w:val="white"/>
+        </w:rPr>
+        <w:t>The Burndown chart shows a steep decline in remaining effort. Our "Actual Remaining Effort" line dropped below the "Ideal Trend" line around Day 4, indicating that the team worked faster than anticipated. We reached zero remaining tasks 2 days before the sprint deadline. This high velocity allowed us to dedicate the remaining time to backlog refinement and researching the feasibility of optional features.</w:t>
       </w:r>
     </w:p>
     <w:p>
@@ -663,207 +645,190 @@
     </w:p>
     <w:p>
       <w:pPr>
-        <w:pStyle w:val="ListParagraph"/>
         <w:numPr>
           <w:ilvl w:val="0"/>
-          <w:numId w:val="2"/>
+          <w:numId w:val="3"/>
         </w:numPr>
-        <w:spacing w:before="40" w:after="40"/>
-        <w:rPr>
-          <w:rFonts w:ascii="Times New Roman" w:hAnsi="Times New Roman" w:cs="Times New Roman"/>
-          <w:sz w:val="22"/>
-          <w:szCs w:val="22"/>
-        </w:rPr>
-      </w:pPr>
-      <w:r>
-        <w:rPr>
-          <w:rFonts w:ascii="Times New Roman" w:eastAsia="Arial" w:hAnsi="Times New Roman" w:cs="Times New Roman"/>
-          <w:sz w:val="22"/>
-          <w:szCs w:val="22"/>
-        </w:rPr>
-        <w:lastRenderedPageBreak/>
-        <w:t>Presented Figma mockups aligned to persona pain-points (tourist navigation, weather prediction, map interactivity).</w:t>
-      </w:r>
-    </w:p>
-    <w:p>
-      <w:pPr>
-        <w:pStyle w:val="ListParagraph"/>
+        <w:spacing w:before="60" w:line="276" w:lineRule="auto"/>
+        <w:rPr>
+          <w:rFonts w:ascii="Times New Roman" w:hAnsi="Times New Roman" w:cs="Times New Roman"/>
+          <w:color w:val="1F1F1F"/>
+          <w:sz w:val="22"/>
+          <w:szCs w:val="22"/>
+          <w:highlight w:val="white"/>
+        </w:rPr>
+      </w:pPr>
+      <w:r>
+        <w:rPr>
+          <w:rFonts w:ascii="Times New Roman" w:hAnsi="Times New Roman" w:cs="Times New Roman"/>
+          <w:b/>
+          <w:bCs/>
+          <w:sz w:val="22"/>
+          <w:szCs w:val="22"/>
+        </w:rPr>
+        <w:t>Mockup Walkthrough:</w:t>
+      </w:r>
+      <w:r>
+        <w:rPr>
+          <w:rFonts w:ascii="Times New Roman" w:hAnsi="Times New Roman" w:cs="Times New Roman"/>
+          <w:color w:val="1F1F1F"/>
+          <w:sz w:val="22"/>
+          <w:szCs w:val="22"/>
+          <w:highlight w:val="white"/>
+        </w:rPr>
+        <w:t xml:space="preserve"> Presented the Figma/PDF mockups, explaining how the UI solves the specific pain points of our personas.</w:t>
+      </w:r>
+    </w:p>
+    <w:p>
+      <w:pPr>
         <w:numPr>
           <w:ilvl w:val="0"/>
-          <w:numId w:val="2"/>
+          <w:numId w:val="3"/>
         </w:numPr>
-        <w:spacing w:before="40" w:after="40"/>
-        <w:rPr>
-          <w:rFonts w:ascii="Times New Roman" w:hAnsi="Times New Roman" w:cs="Times New Roman"/>
-          <w:sz w:val="22"/>
-          <w:szCs w:val="22"/>
-        </w:rPr>
-      </w:pPr>
-      <w:r>
-        <w:rPr>
-          <w:rFonts w:ascii="Times New Roman" w:eastAsia="Arial" w:hAnsi="Times New Roman" w:cs="Times New Roman"/>
-          <w:sz w:val="22"/>
-          <w:szCs w:val="22"/>
-        </w:rPr>
-        <w:t>Demonstrated live MySQL tables populated by the running scrapers.</w:t>
-      </w:r>
-    </w:p>
-    <w:p>
-      <w:pPr>
-        <w:pStyle w:val="ListParagraph"/>
+        <w:spacing w:before="60" w:line="276" w:lineRule="auto"/>
+        <w:rPr>
+          <w:rFonts w:ascii="Times New Roman" w:hAnsi="Times New Roman" w:cs="Times New Roman"/>
+          <w:color w:val="1F1F1F"/>
+          <w:sz w:val="22"/>
+          <w:szCs w:val="22"/>
+          <w:highlight w:val="white"/>
+        </w:rPr>
+      </w:pPr>
+      <w:r>
+        <w:rPr>
+          <w:rFonts w:ascii="Times New Roman" w:hAnsi="Times New Roman" w:cs="Times New Roman"/>
+          <w:b/>
+          <w:bCs/>
+          <w:sz w:val="22"/>
+          <w:szCs w:val="22"/>
+        </w:rPr>
+        <w:t>Data Verification:</w:t>
+      </w:r>
+      <w:r>
+        <w:rPr>
+          <w:rFonts w:ascii="Times New Roman" w:hAnsi="Times New Roman" w:cs="Times New Roman"/>
+          <w:color w:val="1F1F1F"/>
+          <w:sz w:val="22"/>
+          <w:szCs w:val="22"/>
+          <w:highlight w:val="white"/>
+        </w:rPr>
+        <w:t xml:space="preserve"> Showed the live MySQL database tables with rows of real-time data collected over the past few days, proving the stability of our scrapers.</w:t>
+      </w:r>
+    </w:p>
+    <w:p>
+      <w:pPr>
         <w:numPr>
           <w:ilvl w:val="0"/>
-          <w:numId w:val="2"/>
+          <w:numId w:val="3"/>
         </w:numPr>
-        <w:spacing w:before="40" w:after="40"/>
-        <w:rPr>
-          <w:rFonts w:ascii="Times New Roman" w:hAnsi="Times New Roman" w:cs="Times New Roman"/>
-          <w:sz w:val="22"/>
-          <w:szCs w:val="22"/>
-        </w:rPr>
-      </w:pPr>
-      <w:r>
-        <w:rPr>
-          <w:rFonts w:ascii="Times New Roman" w:eastAsia="Arial" w:hAnsi="Times New Roman" w:cs="Times New Roman"/>
-          <w:sz w:val="22"/>
-          <w:szCs w:val="22"/>
-        </w:rPr>
-        <w:t>Opened a scope discussion on the Journey Planner feature; decision deferred to Sprint 2 planning.</w:t>
-      </w:r>
-    </w:p>
-    <w:p>
-      <w:pPr>
-        <w:rPr>
-          <w:rFonts w:ascii="Times New Roman" w:hAnsi="Times New Roman" w:cs="Times New Roman"/>
-          <w:sz w:val="22"/>
-          <w:szCs w:val="22"/>
-        </w:rPr>
-      </w:pPr>
-    </w:p>
-    <w:p>
-      <w:pPr>
-        <w:pStyle w:val="Heading3"/>
-        <w:rPr>
-          <w:rFonts w:ascii="Times New Roman" w:hAnsi="Times New Roman" w:cs="Times New Roman"/>
-        </w:rPr>
-      </w:pPr>
-      <w:r>
-        <w:rPr>
-          <w:rFonts w:ascii="Times New Roman" w:hAnsi="Times New Roman" w:cs="Times New Roman"/>
-        </w:rPr>
-        <w:t>Sprint Retrospective</w:t>
-      </w:r>
-    </w:p>
-    <w:p>
-      <w:pPr>
-        <w:spacing w:before="60" w:after="60"/>
-        <w:rPr>
-          <w:rFonts w:ascii="Times New Roman" w:hAnsi="Times New Roman" w:cs="Times New Roman"/>
-          <w:sz w:val="22"/>
-          <w:szCs w:val="22"/>
-        </w:rPr>
-      </w:pPr>
-      <w:r>
-        <w:rPr>
-          <w:rFonts w:ascii="Times New Roman" w:eastAsia="Arial" w:hAnsi="Times New Roman" w:cs="Times New Roman"/>
+        <w:spacing w:before="60" w:line="276" w:lineRule="auto"/>
+        <w:rPr>
+          <w:rFonts w:ascii="Times New Roman" w:hAnsi="Times New Roman" w:cs="Times New Roman"/>
+          <w:color w:val="1F1F1F"/>
+          <w:sz w:val="22"/>
+          <w:szCs w:val="22"/>
+          <w:highlight w:val="white"/>
+        </w:rPr>
+      </w:pPr>
+      <w:r>
+        <w:rPr>
+          <w:rFonts w:ascii="Times New Roman" w:hAnsi="Times New Roman" w:cs="Times New Roman"/>
           <w:b/>
           <w:bCs/>
           <w:sz w:val="22"/>
           <w:szCs w:val="22"/>
         </w:rPr>
-        <w:t xml:space="preserve">What went well: </w:t>
-      </w:r>
-      <w:r>
+        <w:t>Scope Discussion:</w:t>
+      </w:r>
+      <w:r>
+        <w:rPr>
+          <w:rFonts w:ascii="Times New Roman" w:hAnsi="Times New Roman" w:cs="Times New Roman"/>
+          <w:color w:val="1F1F1F"/>
+          <w:sz w:val="22"/>
+          <w:szCs w:val="22"/>
+          <w:highlight w:val="white"/>
+        </w:rPr>
+        <w:t xml:space="preserve"> Since we finished early, we raised a discussion regarding the "Smart Journey Planner" feature. We are currently evaluating if adding this complex feature fits within our remaining timeline. We agreed to finalize this decision in the next Sprint Planning.</w:t>
+      </w:r>
+    </w:p>
+    <w:p>
+      <w:pPr>
+        <w:rPr>
+          <w:rFonts w:ascii="Times New Roman" w:hAnsi="Times New Roman" w:cs="Times New Roman"/>
+          <w:sz w:val="22"/>
+          <w:szCs w:val="22"/>
+        </w:rPr>
+      </w:pPr>
+    </w:p>
+    <w:p>
+      <w:pPr>
+        <w:rPr>
+          <w:rFonts w:ascii="Times New Roman" w:hAnsi="Times New Roman" w:cs="Times New Roman"/>
+          <w:sz w:val="22"/>
+          <w:szCs w:val="22"/>
+        </w:rPr>
+      </w:pPr>
+    </w:p>
+    <w:p>
+      <w:pPr>
+        <w:pStyle w:val="Heading2"/>
+        <w:rPr>
+          <w:rFonts w:ascii="Times New Roman" w:hAnsi="Times New Roman" w:cs="Times New Roman"/>
+          <w:sz w:val="22"/>
+          <w:szCs w:val="22"/>
+        </w:rPr>
+      </w:pPr>
+      <w:r>
+        <w:rPr>
+          <w:rFonts w:ascii="Times New Roman" w:hAnsi="Times New Roman" w:cs="Times New Roman"/>
+          <w:sz w:val="22"/>
+          <w:szCs w:val="22"/>
+        </w:rPr>
+        <w:t>6.3 Sprint 2 — Backend Integration &amp; Deployment Pipeline</w:t>
+      </w:r>
+    </w:p>
+    <w:p>
+      <w:pPr>
+        <w:pStyle w:val="Heading3"/>
+        <w:rPr>
+          <w:rFonts w:ascii="Times New Roman" w:hAnsi="Times New Roman" w:cs="Times New Roman"/>
+        </w:rPr>
+      </w:pPr>
+      <w:r>
+        <w:rPr>
+          <w:rFonts w:ascii="Times New Roman" w:hAnsi="Times New Roman" w:cs="Times New Roman"/>
+        </w:rPr>
+        <w:t>Implemented Features and Design Decisions</w:t>
+      </w:r>
+    </w:p>
+    <w:p>
+      <w:pPr>
+        <w:spacing w:before="60" w:after="60"/>
         <w:rPr>
           <w:rFonts w:ascii="Times New Roman" w:eastAsia="Arial" w:hAnsi="Times New Roman" w:cs="Times New Roman"/>
           <w:sz w:val="22"/>
           <w:szCs w:val="22"/>
         </w:rPr>
-        <w:t>Discord channel established for daily updates. User interviews successfully validated all three personas, directly shaping the decision to prioritise map interactivity. Scraping scripts delivered ahead of schedule and ran stably.</w:t>
-      </w:r>
-    </w:p>
-    <w:p>
-      <w:pPr>
-        <w:spacing w:before="60" w:after="60"/>
-        <w:rPr>
-          <w:rFonts w:ascii="Times New Roman" w:hAnsi="Times New Roman" w:cs="Times New Roman"/>
-          <w:sz w:val="22"/>
-          <w:szCs w:val="22"/>
-        </w:rPr>
-      </w:pPr>
+      </w:pPr>
+      <w:bookmarkStart w:id="1" w:name="OLE_LINK3"/>
       <w:r>
         <w:rPr>
           <w:rFonts w:ascii="Times New Roman" w:eastAsia="Arial" w:hAnsi="Times New Roman" w:cs="Times New Roman"/>
-          <w:b/>
-          <w:bCs/>
-          <w:sz w:val="22"/>
-          <w:szCs w:val="22"/>
-        </w:rPr>
-        <w:t xml:space="preserve">What could be improved: </w:t>
-      </w:r>
-      <w:r>
-        <w:rPr>
-          <w:rFonts w:ascii="Times New Roman" w:eastAsia="Arial" w:hAnsi="Times New Roman" w:cs="Times New Roman"/>
-          <w:sz w:val="22"/>
-          <w:szCs w:val="22"/>
-        </w:rPr>
-        <w:t>Some members were unfamiliar with API requests and local MySQL configuration, causing early delays. Peer support will be increased in future sprints to resolve technical blockers faster.</w:t>
-      </w:r>
-    </w:p>
-    <w:p>
-      <w:pPr>
-        <w:spacing w:before="60" w:after="60"/>
-        <w:rPr>
-          <w:rFonts w:ascii="Times New Roman" w:hAnsi="Times New Roman" w:cs="Times New Roman"/>
-          <w:sz w:val="22"/>
-          <w:szCs w:val="22"/>
-        </w:rPr>
-      </w:pPr>
-      <w:r>
-        <w:rPr>
-          <w:rFonts w:ascii="Times New Roman" w:eastAsia="Arial" w:hAnsi="Times New Roman" w:cs="Times New Roman"/>
-          <w:b/>
-          <w:bCs/>
-          <w:sz w:val="22"/>
-          <w:szCs w:val="22"/>
-        </w:rPr>
-        <w:t xml:space="preserve">For next sprint: </w:t>
-      </w:r>
-      <w:r>
-        <w:rPr>
-          <w:rFonts w:ascii="Times New Roman" w:eastAsia="Arial" w:hAnsi="Times New Roman" w:cs="Times New Roman"/>
-          <w:sz w:val="22"/>
-          <w:szCs w:val="22"/>
-        </w:rPr>
-        <w:t>Set up the Flask application and connect it to the database; get scraped data displaying on a live map; finalise the Journey Planner feasibility study.</w:t>
-      </w:r>
-    </w:p>
-    <w:p>
-      <w:pPr>
-        <w:rPr>
-          <w:rFonts w:ascii="Times New Roman" w:hAnsi="Times New Roman" w:cs="Times New Roman"/>
-          <w:sz w:val="22"/>
-          <w:szCs w:val="22"/>
-        </w:rPr>
-      </w:pPr>
-    </w:p>
-    <w:p>
-      <w:pPr>
-        <w:pStyle w:val="Heading2"/>
-        <w:rPr>
-          <w:rFonts w:ascii="Times New Roman" w:hAnsi="Times New Roman" w:cs="Times New Roman"/>
-          <w:sz w:val="22"/>
-          <w:szCs w:val="22"/>
-        </w:rPr>
-      </w:pPr>
-      <w:r>
-        <w:rPr>
-          <w:rFonts w:ascii="Times New Roman" w:hAnsi="Times New Roman" w:cs="Times New Roman"/>
-          <w:sz w:val="22"/>
-          <w:szCs w:val="22"/>
-        </w:rPr>
-        <w:t>6.3 Sprint 2 — Backend Integration &amp; Deployment Pipeline</w:t>
-      </w:r>
+          <w:sz w:val="22"/>
+          <w:szCs w:val="22"/>
+        </w:rPr>
+        <w:t>The Flask application was built out with Weather and Station Read APIs returning properly formatted JSON from the shared MySQL database. JWT-based user authentication was integrated with secure password hashing. A Jenkins CI/CD pipeline was configured with a Kubernetes agent, automating Docker builds and EC2 deployments on every push to main. A Git feature-branch workflow was adopted team-wide. Crucially, the Journey Planner backend endpoint was delivered, closing the open scope question from Sprint 1, though it required significant refactoring to handle edge cases and correct route-calculation logic.</w:t>
+      </w:r>
+    </w:p>
+    <w:bookmarkEnd w:id="1"/>
+    <w:p>
+      <w:pPr>
+        <w:rPr>
+          <w:rFonts w:ascii="Times New Roman" w:hAnsi="Times New Roman" w:cs="Times New Roman"/>
+          <w:sz w:val="22"/>
+          <w:szCs w:val="22"/>
+        </w:rPr>
+      </w:pPr>
     </w:p>
     <w:p>
       <w:pPr>
@@ -876,55 +841,14 @@
         <w:rPr>
           <w:rFonts w:ascii="Times New Roman" w:hAnsi="Times New Roman" w:cs="Times New Roman"/>
         </w:rPr>
-        <w:t>Implemented Features and Design Decisions</w:t>
-      </w:r>
-    </w:p>
-    <w:p>
-      <w:pPr>
-        <w:spacing w:before="60" w:after="60"/>
-        <w:rPr>
-          <w:rFonts w:ascii="Times New Roman" w:hAnsi="Times New Roman" w:cs="Times New Roman"/>
-          <w:sz w:val="22"/>
-          <w:szCs w:val="22"/>
-        </w:rPr>
-      </w:pPr>
-      <w:r>
-        <w:rPr>
-          <w:rFonts w:ascii="Times New Roman" w:eastAsia="Arial" w:hAnsi="Times New Roman" w:cs="Times New Roman"/>
-          <w:sz w:val="22"/>
-          <w:szCs w:val="22"/>
-        </w:rPr>
-        <w:t>The Flask application was built out with Weather and Station Read APIs returning properly formatted JSON from the shared MySQL database. JWT-based user authentication was integrated with secure password hashing. A Jenkins CI/CD pipeline was configured with a Kubernetes agent, automating Docker builds and EC2 deployments on every push to main. A Git feature-branch workflow was adopted team-wide. Crucially, the Journey Planner backend endpoint was delivered, closing the open scope question from Sprint 1, though it required significant refactoring to handle edge cases and correct route-calculation logic.</w:t>
-      </w:r>
-    </w:p>
-    <w:p>
-      <w:pPr>
-        <w:rPr>
-          <w:rFonts w:ascii="Times New Roman" w:hAnsi="Times New Roman" w:cs="Times New Roman"/>
-          <w:sz w:val="22"/>
-          <w:szCs w:val="22"/>
-        </w:rPr>
-      </w:pPr>
+        <w:t>Burndown Chart</w:t>
+      </w:r>
     </w:p>
     <w:p>
       <w:pPr>
         <w:pStyle w:val="Heading3"/>
         <w:rPr>
           <w:rFonts w:ascii="Times New Roman" w:hAnsi="Times New Roman" w:cs="Times New Roman"/>
-        </w:rPr>
-      </w:pPr>
-      <w:r>
-        <w:rPr>
-          <w:rFonts w:ascii="Times New Roman" w:hAnsi="Times New Roman" w:cs="Times New Roman"/>
-        </w:rPr>
-        <w:t>Burndown Chart</w:t>
-      </w:r>
-    </w:p>
-    <w:p>
-      <w:pPr>
-        <w:pStyle w:val="Heading3"/>
-        <w:rPr>
-          <w:rFonts w:ascii="Times New Roman" w:hAnsi="Times New Roman" w:cs="Times New Roman" w:hint="eastAsia"/>
         </w:rPr>
       </w:pPr>
       <w:r>
@@ -977,20 +901,19 @@
     </w:p>
     <w:p>
       <w:pPr>
-        <w:spacing w:before="60" w:after="60"/>
-        <w:rPr>
-          <w:rFonts w:ascii="Times New Roman" w:hAnsi="Times New Roman" w:cs="Times New Roman"/>
-          <w:sz w:val="22"/>
-          <w:szCs w:val="22"/>
-        </w:rPr>
-      </w:pPr>
-      <w:r>
-        <w:rPr>
-          <w:rFonts w:ascii="Times New Roman" w:eastAsia="Arial" w:hAnsi="Times New Roman" w:cs="Times New Roman"/>
-          <w:sz w:val="22"/>
-          <w:szCs w:val="22"/>
-        </w:rPr>
-        <w:t>The chart shows a staircase pattern reflecting the mandated two-day update cadence. Despite this, the Actual Remaining Effort line dropped below the Ideal Trend by Day 4 and stayed beneath it for the rest of the sprint, confirming strong team velocity. All goals were completed by Day 10.</w:t>
+        <w:rPr>
+          <w:rFonts w:ascii="Times New Roman" w:hAnsi="Times New Roman" w:cs="Times New Roman"/>
+          <w:sz w:val="22"/>
+          <w:szCs w:val="22"/>
+        </w:rPr>
+      </w:pPr>
+      <w:r>
+        <w:rPr>
+          <w:rFonts w:ascii="Times New Roman" w:hAnsi="Times New Roman" w:cs="Times New Roman"/>
+          <w:sz w:val="22"/>
+          <w:szCs w:val="22"/>
+        </w:rPr>
+        <w:t>The burndown chart displays a staircase pattern which directly reflects the project requirement to update the chart every two days. Despite these mandated reporting intervals, the actual remaining effort dropped below the ideal available trend line by Day 4 and remained beneath it for the rest duration of the sprint. This demonstrates that a strong development velocity was maintained by the team. All sprint goals were completed by Day 10.</w:t>
       </w:r>
     </w:p>
     <w:p>
@@ -1021,22 +944,32 @@
         <w:pStyle w:val="ListParagraph"/>
         <w:numPr>
           <w:ilvl w:val="0"/>
-          <w:numId w:val="2"/>
+          <w:numId w:val="4"/>
         </w:numPr>
-        <w:spacing w:before="40" w:after="40"/>
-        <w:rPr>
-          <w:rFonts w:ascii="Times New Roman" w:hAnsi="Times New Roman" w:cs="Times New Roman"/>
-          <w:sz w:val="22"/>
-          <w:szCs w:val="22"/>
-        </w:rPr>
-      </w:pPr>
-      <w:r>
-        <w:rPr>
-          <w:rFonts w:ascii="Times New Roman" w:eastAsia="Arial" w:hAnsi="Times New Roman" w:cs="Times New Roman"/>
-          <w:sz w:val="22"/>
-          <w:szCs w:val="22"/>
-        </w:rPr>
-        <w:t>Demonstrated Weather and Station APIs returning live JSON data.</w:t>
+        <w:spacing w:before="60" w:line="276" w:lineRule="auto"/>
+        <w:rPr>
+          <w:rFonts w:ascii="Times New Roman" w:hAnsi="Times New Roman" w:cs="Times New Roman"/>
+          <w:sz w:val="22"/>
+          <w:szCs w:val="22"/>
+        </w:rPr>
+      </w:pPr>
+      <w:r>
+        <w:rPr>
+          <w:rFonts w:ascii="Times New Roman" w:hAnsi="Times New Roman" w:cs="Times New Roman"/>
+          <w:b/>
+          <w:bCs/>
+          <w:sz w:val="22"/>
+          <w:szCs w:val="22"/>
+        </w:rPr>
+        <w:t>API Demonstration</w:t>
+      </w:r>
+      <w:r>
+        <w:rPr>
+          <w:rFonts w:ascii="Times New Roman" w:hAnsi="Times New Roman" w:cs="Times New Roman"/>
+          <w:sz w:val="22"/>
+          <w:szCs w:val="22"/>
+        </w:rPr>
+        <w:t>: Showcased the operational Weather and Station Read APIs successfully returning properly formatted JSON data from both live external APIs and the local MySQL database.</w:t>
       </w:r>
     </w:p>
     <w:p>
@@ -1044,22 +977,32 @@
         <w:pStyle w:val="ListParagraph"/>
         <w:numPr>
           <w:ilvl w:val="0"/>
-          <w:numId w:val="2"/>
+          <w:numId w:val="4"/>
         </w:numPr>
-        <w:spacing w:before="40" w:after="40"/>
-        <w:rPr>
-          <w:rFonts w:ascii="Times New Roman" w:hAnsi="Times New Roman" w:cs="Times New Roman"/>
-          <w:sz w:val="22"/>
-          <w:szCs w:val="22"/>
-        </w:rPr>
-      </w:pPr>
-      <w:r>
-        <w:rPr>
-          <w:rFonts w:ascii="Times New Roman" w:eastAsia="Arial" w:hAnsi="Times New Roman" w:cs="Times New Roman"/>
-          <w:sz w:val="22"/>
-          <w:szCs w:val="22"/>
-        </w:rPr>
-        <w:t>Showcased JWT login flow and hashed password storage.</w:t>
+        <w:spacing w:before="60" w:line="276" w:lineRule="auto"/>
+        <w:rPr>
+          <w:rFonts w:ascii="Times New Roman" w:hAnsi="Times New Roman" w:cs="Times New Roman"/>
+          <w:sz w:val="22"/>
+          <w:szCs w:val="22"/>
+        </w:rPr>
+      </w:pPr>
+      <w:r>
+        <w:rPr>
+          <w:rFonts w:ascii="Times New Roman" w:hAnsi="Times New Roman" w:cs="Times New Roman"/>
+          <w:b/>
+          <w:bCs/>
+          <w:sz w:val="22"/>
+          <w:szCs w:val="22"/>
+        </w:rPr>
+        <w:t>Security &amp; Authentication</w:t>
+      </w:r>
+      <w:r>
+        <w:rPr>
+          <w:rFonts w:ascii="Times New Roman" w:hAnsi="Times New Roman" w:cs="Times New Roman"/>
+          <w:sz w:val="22"/>
+          <w:szCs w:val="22"/>
+        </w:rPr>
+        <w:t>: Demonstrated the user authentication flow, highlighting the successful generation of JWT tokens upon login and the secure hashing of passwords in the database.</w:t>
       </w:r>
     </w:p>
     <w:p>
@@ -1067,22 +1010,32 @@
         <w:pStyle w:val="ListParagraph"/>
         <w:numPr>
           <w:ilvl w:val="0"/>
-          <w:numId w:val="2"/>
+          <w:numId w:val="4"/>
         </w:numPr>
-        <w:spacing w:before="40" w:after="40"/>
-        <w:rPr>
-          <w:rFonts w:ascii="Times New Roman" w:hAnsi="Times New Roman" w:cs="Times New Roman"/>
-          <w:sz w:val="22"/>
-          <w:szCs w:val="22"/>
-        </w:rPr>
-      </w:pPr>
-      <w:r>
-        <w:rPr>
-          <w:rFonts w:ascii="Times New Roman" w:eastAsia="Arial" w:hAnsi="Times New Roman" w:cs="Times New Roman"/>
-          <w:sz w:val="22"/>
-          <w:szCs w:val="22"/>
-        </w:rPr>
-        <w:t>Live CI/CD demo: a code push triggered a Jenkins build and automatic EC2 deployment.</w:t>
+        <w:spacing w:before="60" w:line="276" w:lineRule="auto"/>
+        <w:rPr>
+          <w:rFonts w:ascii="Times New Roman" w:hAnsi="Times New Roman" w:cs="Times New Roman"/>
+          <w:sz w:val="22"/>
+          <w:szCs w:val="22"/>
+        </w:rPr>
+      </w:pPr>
+      <w:r>
+        <w:rPr>
+          <w:rFonts w:ascii="Times New Roman" w:hAnsi="Times New Roman" w:cs="Times New Roman"/>
+          <w:b/>
+          <w:bCs/>
+          <w:sz w:val="22"/>
+          <w:szCs w:val="22"/>
+        </w:rPr>
+        <w:t>Pipeline Verification</w:t>
+      </w:r>
+      <w:r>
+        <w:rPr>
+          <w:rFonts w:ascii="Times New Roman" w:hAnsi="Times New Roman" w:cs="Times New Roman"/>
+          <w:sz w:val="22"/>
+          <w:szCs w:val="22"/>
+        </w:rPr>
+        <w:t>: Conducted a live demonstration of the CI/CD pipeline. A code push was shown triggering a Jenkins build, which subsequently deployed the updated Flask application to the EC2 instance automatically.</w:t>
       </w:r>
     </w:p>
     <w:p>
@@ -1090,158 +1043,113 @@
         <w:pStyle w:val="ListParagraph"/>
         <w:numPr>
           <w:ilvl w:val="0"/>
-          <w:numId w:val="2"/>
+          <w:numId w:val="4"/>
         </w:numPr>
-        <w:spacing w:before="40" w:after="40"/>
-        <w:rPr>
-          <w:rFonts w:ascii="Times New Roman" w:hAnsi="Times New Roman" w:cs="Times New Roman"/>
-          <w:sz w:val="22"/>
-          <w:szCs w:val="22"/>
-        </w:rPr>
-      </w:pPr>
-      <w:r>
-        <w:rPr>
-          <w:rFonts w:ascii="Times New Roman" w:eastAsia="Arial" w:hAnsi="Times New Roman" w:cs="Times New Roman"/>
-          <w:sz w:val="22"/>
-          <w:szCs w:val="22"/>
-        </w:rPr>
-        <w:t>Confirmed Journey Planner inclusion and basic backend functionality.</w:t>
-      </w:r>
-    </w:p>
-    <w:p>
-      <w:pPr>
-        <w:rPr>
-          <w:rFonts w:ascii="Times New Roman" w:hAnsi="Times New Roman" w:cs="Times New Roman"/>
-          <w:sz w:val="22"/>
-          <w:szCs w:val="22"/>
-        </w:rPr>
-      </w:pPr>
-    </w:p>
-    <w:p>
-      <w:pPr>
-        <w:pStyle w:val="Heading3"/>
-        <w:rPr>
-          <w:rFonts w:ascii="Times New Roman" w:hAnsi="Times New Roman" w:cs="Times New Roman"/>
-        </w:rPr>
-      </w:pPr>
-      <w:r>
-        <w:rPr>
-          <w:rFonts w:ascii="Times New Roman" w:hAnsi="Times New Roman" w:cs="Times New Roman"/>
-        </w:rPr>
-        <w:t>Sprint Retrospective</w:t>
-      </w:r>
-    </w:p>
-    <w:p>
-      <w:pPr>
-        <w:spacing w:before="60" w:after="60"/>
-        <w:rPr>
-          <w:rFonts w:ascii="Times New Roman" w:hAnsi="Times New Roman" w:cs="Times New Roman"/>
-          <w:sz w:val="22"/>
-          <w:szCs w:val="22"/>
-        </w:rPr>
-      </w:pPr>
-      <w:r>
-        <w:rPr>
-          <w:rFonts w:ascii="Times New Roman" w:eastAsia="Arial" w:hAnsi="Times New Roman" w:cs="Times New Roman"/>
+        <w:spacing w:before="60" w:line="276" w:lineRule="auto"/>
+        <w:rPr>
+          <w:rFonts w:ascii="Times New Roman" w:hAnsi="Times New Roman" w:cs="Times New Roman"/>
+          <w:sz w:val="22"/>
+          <w:szCs w:val="22"/>
+        </w:rPr>
+      </w:pPr>
+      <w:r>
+        <w:rPr>
+          <w:rFonts w:ascii="Times New Roman" w:hAnsi="Times New Roman" w:cs="Times New Roman"/>
           <w:b/>
           <w:bCs/>
           <w:sz w:val="22"/>
           <w:szCs w:val="22"/>
         </w:rPr>
         <w:lastRenderedPageBreak/>
-        <w:t xml:space="preserve">What went well: </w:t>
-      </w:r>
-      <w:r>
+        <w:t>Scope Confirmation</w:t>
+      </w:r>
+      <w:r>
+        <w:rPr>
+          <w:rFonts w:ascii="Times New Roman" w:hAnsi="Times New Roman" w:cs="Times New Roman"/>
+          <w:sz w:val="22"/>
+          <w:szCs w:val="22"/>
+        </w:rPr>
+        <w:t>: Confirmed the successful inclusion and basic backend functionality of the Journey Planner endpoint, finalizing the open discussion from Sprint 1.</w:t>
+      </w:r>
+    </w:p>
+    <w:p>
+      <w:pPr>
+        <w:rPr>
+          <w:rFonts w:ascii="Times New Roman" w:hAnsi="Times New Roman" w:cs="Times New Roman"/>
+          <w:sz w:val="22"/>
+          <w:szCs w:val="22"/>
+        </w:rPr>
+      </w:pPr>
+    </w:p>
+    <w:p>
+      <w:pPr>
+        <w:rPr>
+          <w:rFonts w:ascii="Times New Roman" w:hAnsi="Times New Roman" w:cs="Times New Roman"/>
+          <w:sz w:val="22"/>
+          <w:szCs w:val="22"/>
+        </w:rPr>
+      </w:pPr>
+    </w:p>
+    <w:p>
+      <w:pPr>
+        <w:pStyle w:val="Heading2"/>
+        <w:rPr>
+          <w:rFonts w:ascii="Times New Roman" w:hAnsi="Times New Roman" w:cs="Times New Roman"/>
+          <w:sz w:val="22"/>
+          <w:szCs w:val="22"/>
+        </w:rPr>
+      </w:pPr>
+      <w:r>
+        <w:rPr>
+          <w:rFonts w:ascii="Times New Roman" w:hAnsi="Times New Roman" w:cs="Times New Roman"/>
+          <w:sz w:val="22"/>
+          <w:szCs w:val="22"/>
+        </w:rPr>
+        <w:t>6.4 Sprint 3 — Additional Features &amp; Frontend Implementation</w:t>
+      </w:r>
+    </w:p>
+    <w:p>
+      <w:pPr>
+        <w:pStyle w:val="Heading3"/>
+        <w:rPr>
+          <w:rFonts w:ascii="Times New Roman" w:hAnsi="Times New Roman" w:cs="Times New Roman"/>
+        </w:rPr>
+      </w:pPr>
+      <w:r>
+        <w:rPr>
+          <w:rFonts w:ascii="Times New Roman" w:hAnsi="Times New Roman" w:cs="Times New Roman"/>
+        </w:rPr>
+        <w:t>Implemented Features and Design Decisions</w:t>
+      </w:r>
+    </w:p>
+    <w:p>
+      <w:pPr>
+        <w:spacing w:before="60" w:after="60"/>
         <w:rPr>
           <w:rFonts w:ascii="Times New Roman" w:eastAsia="Arial" w:hAnsi="Times New Roman" w:cs="Times New Roman"/>
           <w:sz w:val="22"/>
           <w:szCs w:val="22"/>
         </w:rPr>
-        <w:t>The Git feature-branch workflow and Jenkins pipeline accelerated testing and removed manual deployment effort. Resolving the scope question early enabled delivery of the complex Journey Planner and secure login features.</w:t>
-      </w:r>
-    </w:p>
-    <w:p>
-      <w:pPr>
-        <w:spacing w:before="60" w:after="60"/>
-        <w:rPr>
-          <w:rFonts w:ascii="Times New Roman" w:hAnsi="Times New Roman" w:cs="Times New Roman"/>
-          <w:sz w:val="22"/>
-          <w:szCs w:val="22"/>
-        </w:rPr>
-      </w:pPr>
+      </w:pPr>
+      <w:bookmarkStart w:id="2" w:name="OLE_LINK4"/>
       <w:r>
         <w:rPr>
           <w:rFonts w:ascii="Times New Roman" w:eastAsia="Arial" w:hAnsi="Times New Roman" w:cs="Times New Roman"/>
-          <w:b/>
-          <w:bCs/>
-          <w:sz w:val="22"/>
-          <w:szCs w:val="22"/>
-        </w:rPr>
-        <w:t xml:space="preserve">What could be improved: </w:t>
-      </w:r>
-      <w:r>
-        <w:rPr>
-          <w:rFonts w:ascii="Times New Roman" w:eastAsia="Arial" w:hAnsi="Times New Roman" w:cs="Times New Roman"/>
-          <w:sz w:val="22"/>
-          <w:szCs w:val="22"/>
-        </w:rPr>
-        <w:t>API endpoints lacked documentation at the outset, forcing frontend developers to read backend source code to find correct routes. The Journey Planner also required substantial refactoring for edge-case handling.</w:t>
-      </w:r>
-    </w:p>
-    <w:p>
-      <w:pPr>
-        <w:spacing w:before="60" w:after="60"/>
-        <w:rPr>
-          <w:rFonts w:ascii="Times New Roman" w:hAnsi="Times New Roman" w:cs="Times New Roman"/>
-          <w:sz w:val="22"/>
-          <w:szCs w:val="22"/>
-        </w:rPr>
-      </w:pPr>
-      <w:r>
-        <w:rPr>
-          <w:rFonts w:ascii="Times New Roman" w:eastAsia="Arial" w:hAnsi="Times New Roman" w:cs="Times New Roman"/>
-          <w:b/>
-          <w:bCs/>
-          <w:sz w:val="22"/>
-          <w:szCs w:val="22"/>
-        </w:rPr>
-        <w:t xml:space="preserve">For next sprint: </w:t>
-      </w:r>
-      <w:r>
-        <w:rPr>
-          <w:rFonts w:ascii="Times New Roman" w:eastAsia="Arial" w:hAnsi="Times New Roman" w:cs="Times New Roman"/>
-          <w:sz w:val="22"/>
-          <w:szCs w:val="22"/>
-        </w:rPr>
-        <w:t>Build React UIs for the Journey Planner and Login; migrate the database to Amazon RDS; produce API documentation to streamline frontend–backend integration.</w:t>
-      </w:r>
-    </w:p>
-    <w:p>
-      <w:pPr>
-        <w:rPr>
-          <w:rFonts w:ascii="Times New Roman" w:hAnsi="Times New Roman" w:cs="Times New Roman"/>
-          <w:sz w:val="22"/>
-          <w:szCs w:val="22"/>
-        </w:rPr>
-      </w:pPr>
-    </w:p>
-    <w:p>
-      <w:pPr>
-        <w:pStyle w:val="Heading2"/>
-        <w:rPr>
-          <w:rFonts w:ascii="Times New Roman" w:hAnsi="Times New Roman" w:cs="Times New Roman"/>
-          <w:sz w:val="22"/>
-          <w:szCs w:val="22"/>
-        </w:rPr>
-      </w:pPr>
-      <w:r>
-        <w:rPr>
-          <w:rFonts w:ascii="Times New Roman" w:hAnsi="Times New Roman" w:cs="Times New Roman"/>
-          <w:sz w:val="22"/>
-          <w:szCs w:val="22"/>
-        </w:rPr>
-        <w:t>6.4 Sprint 3 — Additional Features &amp; Frontend Implementation</w:t>
-      </w:r>
+          <w:sz w:val="22"/>
+          <w:szCs w:val="22"/>
+        </w:rPr>
+        <w:t>Three AI chat features were implemented using the Langchain framework and the Aliyun Qwen API, with chat history persisted in new database tables and displayed on login. The React frontend was updated to show available bike and stand counts on station hover, and data is now pre-fetched on page load to eliminate display latency. The database was migrated from a local instance to Amazon RDS to overcome EC2 memory constraints and improve query performance. The CI/CD pipeline was verified end-to-end with Docker containerisation confirming a stable, reproducible deployment process.</w:t>
+      </w:r>
+    </w:p>
+    <w:bookmarkEnd w:id="2"/>
+    <w:p>
+      <w:pPr>
+        <w:rPr>
+          <w:rFonts w:ascii="Times New Roman" w:hAnsi="Times New Roman" w:cs="Times New Roman"/>
+          <w:sz w:val="22"/>
+          <w:szCs w:val="22"/>
+        </w:rPr>
+      </w:pPr>
     </w:p>
     <w:p>
       <w:pPr>
@@ -1254,55 +1162,14 @@
         <w:rPr>
           <w:rFonts w:ascii="Times New Roman" w:hAnsi="Times New Roman" w:cs="Times New Roman"/>
         </w:rPr>
-        <w:t>Implemented Features and Design Decisions</w:t>
-      </w:r>
-    </w:p>
-    <w:p>
-      <w:pPr>
-        <w:spacing w:before="60" w:after="60"/>
-        <w:rPr>
-          <w:rFonts w:ascii="Times New Roman" w:hAnsi="Times New Roman" w:cs="Times New Roman"/>
-          <w:sz w:val="22"/>
-          <w:szCs w:val="22"/>
-        </w:rPr>
-      </w:pPr>
-      <w:r>
-        <w:rPr>
-          <w:rFonts w:ascii="Times New Roman" w:eastAsia="Arial" w:hAnsi="Times New Roman" w:cs="Times New Roman"/>
-          <w:sz w:val="22"/>
-          <w:szCs w:val="22"/>
-        </w:rPr>
-        <w:t>Three AI chat features were implemented using the Langchain framework and the Aliyun Qwen API, with chat history persisted in new database tables and displayed on login. The React frontend was updated to show available bike and stand counts on station hover, and data is now pre-fetched on page load to eliminate display latency. The database was migrated from a local instance to Amazon RDS to overcome EC2 memory constraints and improve query performance. The CI/CD pipeline was verified end-to-end with Docker containerisation confirming a stable, reproducible deployment process.</w:t>
-      </w:r>
-    </w:p>
-    <w:p>
-      <w:pPr>
-        <w:rPr>
-          <w:rFonts w:ascii="Times New Roman" w:hAnsi="Times New Roman" w:cs="Times New Roman"/>
-          <w:sz w:val="22"/>
-          <w:szCs w:val="22"/>
-        </w:rPr>
-      </w:pPr>
+        <w:t>Burndown Chart</w:t>
+      </w:r>
     </w:p>
     <w:p>
       <w:pPr>
         <w:pStyle w:val="Heading3"/>
         <w:rPr>
           <w:rFonts w:ascii="Times New Roman" w:hAnsi="Times New Roman" w:cs="Times New Roman"/>
-        </w:rPr>
-      </w:pPr>
-      <w:r>
-        <w:rPr>
-          <w:rFonts w:ascii="Times New Roman" w:hAnsi="Times New Roman" w:cs="Times New Roman"/>
-        </w:rPr>
-        <w:t>Burndown Chart</w:t>
-      </w:r>
-    </w:p>
-    <w:p>
-      <w:pPr>
-        <w:pStyle w:val="Heading3"/>
-        <w:rPr>
-          <w:rFonts w:ascii="Times New Roman" w:hAnsi="Times New Roman" w:cs="Times New Roman" w:hint="eastAsia"/>
         </w:rPr>
       </w:pPr>
       <w:r>
@@ -1355,26 +1222,34 @@
     </w:p>
     <w:p>
       <w:pPr>
-        <w:spacing w:before="60" w:after="60"/>
-        <w:rPr>
-          <w:rFonts w:ascii="Times New Roman" w:hAnsi="Times New Roman" w:cs="Times New Roman"/>
-          <w:sz w:val="22"/>
-          <w:szCs w:val="22"/>
-        </w:rPr>
-      </w:pPr>
-      <w:r>
-        <w:rPr>
-          <w:rFonts w:ascii="Times New Roman" w:eastAsia="Arial" w:hAnsi="Times New Roman" w:cs="Times New Roman"/>
-          <w:sz w:val="22"/>
-          <w:szCs w:val="22"/>
-        </w:rPr>
-        <w:t>The burndown chart was not explicitly described in the sprint records; the team confirmed all sprint goals were completed within the sprint window.</w:t>
-      </w:r>
-    </w:p>
-    <w:p>
-      <w:pPr>
-        <w:rPr>
-          <w:rFonts w:ascii="Times New Roman" w:hAnsi="Times New Roman" w:cs="Times New Roman"/>
+        <w:pBdr>
+          <w:top w:val="nil"/>
+          <w:left w:val="nil"/>
+          <w:bottom w:val="nil"/>
+          <w:right w:val="nil"/>
+          <w:between w:val="nil"/>
+        </w:pBdr>
+        <w:spacing w:after="200"/>
+        <w:ind w:right="147"/>
+        <w:rPr>
+          <w:rFonts w:ascii="Times New Roman" w:eastAsia="Times New Roman" w:hAnsi="Times New Roman" w:cs="Times New Roman"/>
+          <w:sz w:val="22"/>
+          <w:szCs w:val="22"/>
+        </w:rPr>
+      </w:pPr>
+      <w:r>
+        <w:rPr>
+          <w:rFonts w:ascii="Times New Roman" w:eastAsia="Times New Roman" w:hAnsi="Times New Roman" w:cs="Times New Roman"/>
+          <w:sz w:val="22"/>
+          <w:szCs w:val="22"/>
+        </w:rPr>
+        <w:t>This 10-day burndown chart tracks an initial 20 story points. Despite a complete progress stall between Days 3 and 5 that put them behind the ideal timeline, the team sharply accelerated their work. They ultimately recovered and finished all tasks a day early on Day 9.</w:t>
+      </w:r>
+    </w:p>
+    <w:p>
+      <w:pPr>
+        <w:rPr>
+          <w:rFonts w:ascii="Times New Roman" w:hAnsi="Times New Roman" w:cs="Times New Roman" w:hint="eastAsia"/>
           <w:sz w:val="22"/>
           <w:szCs w:val="22"/>
         </w:rPr>
@@ -1399,22 +1274,40 @@
         <w:pStyle w:val="ListParagraph"/>
         <w:numPr>
           <w:ilvl w:val="0"/>
-          <w:numId w:val="2"/>
+          <w:numId w:val="5"/>
         </w:numPr>
-        <w:spacing w:before="40" w:after="40"/>
-        <w:rPr>
-          <w:rFonts w:ascii="Times New Roman" w:hAnsi="Times New Roman" w:cs="Times New Roman"/>
-          <w:sz w:val="22"/>
-          <w:szCs w:val="22"/>
-        </w:rPr>
-      </w:pPr>
-      <w:r>
-        <w:rPr>
-          <w:rFonts w:ascii="Times New Roman" w:eastAsia="Arial" w:hAnsi="Times New Roman" w:cs="Times New Roman"/>
-          <w:sz w:val="22"/>
-          <w:szCs w:val="22"/>
-        </w:rPr>
-        <w:t>Demonstrated AI chat with history storage and LLM memory via new database tables.</w:t>
+        <w:pBdr>
+          <w:top w:val="nil"/>
+          <w:left w:val="nil"/>
+          <w:bottom w:val="nil"/>
+          <w:right w:val="nil"/>
+          <w:between w:val="nil"/>
+        </w:pBdr>
+        <w:spacing w:before="60" w:line="276" w:lineRule="auto"/>
+        <w:ind w:right="144"/>
+        <w:rPr>
+          <w:rFonts w:ascii="Times New Roman" w:eastAsia="Times New Roman" w:hAnsi="Times New Roman" w:cs="Times New Roman"/>
+          <w:sz w:val="22"/>
+          <w:szCs w:val="22"/>
+        </w:rPr>
+      </w:pPr>
+      <w:r>
+        <w:rPr>
+          <w:rFonts w:ascii="Times New Roman" w:eastAsia="Times New Roman" w:hAnsi="Times New Roman" w:cs="Times New Roman"/>
+          <w:b/>
+          <w:bCs/>
+          <w:sz w:val="22"/>
+          <w:szCs w:val="22"/>
+        </w:rPr>
+        <w:t>AI Chat Features</w:t>
+      </w:r>
+      <w:r>
+        <w:rPr>
+          <w:rFonts w:ascii="Times New Roman" w:eastAsia="Times New Roman" w:hAnsi="Times New Roman" w:cs="Times New Roman"/>
+          <w:sz w:val="22"/>
+          <w:szCs w:val="22"/>
+        </w:rPr>
+        <w:t>: Successfully implemented the three core AI features using the Langchain framework and Aliyun API. Demonstrating chat history storage and LLM memory through new database tables, with chat history displayed upon user login.</w:t>
       </w:r>
     </w:p>
     <w:p>
@@ -1422,22 +1315,40 @@
         <w:pStyle w:val="ListParagraph"/>
         <w:numPr>
           <w:ilvl w:val="0"/>
-          <w:numId w:val="2"/>
+          <w:numId w:val="5"/>
         </w:numPr>
-        <w:spacing w:before="40" w:after="40"/>
-        <w:rPr>
-          <w:rFonts w:ascii="Times New Roman" w:hAnsi="Times New Roman" w:cs="Times New Roman"/>
-          <w:sz w:val="22"/>
-          <w:szCs w:val="22"/>
-        </w:rPr>
-      </w:pPr>
-      <w:r>
-        <w:rPr>
-          <w:rFonts w:ascii="Times New Roman" w:eastAsia="Arial" w:hAnsi="Times New Roman" w:cs="Times New Roman"/>
-          <w:sz w:val="22"/>
-          <w:szCs w:val="22"/>
-        </w:rPr>
-        <w:t>Confirmed Flask backend completeness through Postman testing.</w:t>
+        <w:pBdr>
+          <w:top w:val="nil"/>
+          <w:left w:val="nil"/>
+          <w:bottom w:val="nil"/>
+          <w:right w:val="nil"/>
+          <w:between w:val="nil"/>
+        </w:pBdr>
+        <w:spacing w:before="60" w:line="276" w:lineRule="auto"/>
+        <w:ind w:right="144"/>
+        <w:rPr>
+          <w:rFonts w:ascii="Times New Roman" w:eastAsia="Times New Roman" w:hAnsi="Times New Roman" w:cs="Times New Roman"/>
+          <w:sz w:val="22"/>
+          <w:szCs w:val="22"/>
+        </w:rPr>
+      </w:pPr>
+      <w:r>
+        <w:rPr>
+          <w:rFonts w:ascii="Times New Roman" w:eastAsia="Times New Roman" w:hAnsi="Times New Roman" w:cs="Times New Roman"/>
+          <w:b/>
+          <w:bCs/>
+          <w:sz w:val="22"/>
+          <w:szCs w:val="22"/>
+        </w:rPr>
+        <w:t>Backend Completion</w:t>
+      </w:r>
+      <w:r>
+        <w:rPr>
+          <w:rFonts w:ascii="Times New Roman" w:eastAsia="Times New Roman" w:hAnsi="Times New Roman" w:cs="Times New Roman"/>
+          <w:sz w:val="22"/>
+          <w:szCs w:val="22"/>
+        </w:rPr>
+        <w:t>: The Flask backend application is nearing completion, successfully returning the required data, confirmed through Postman testing.</w:t>
       </w:r>
     </w:p>
     <w:p>
@@ -1445,22 +1356,40 @@
         <w:pStyle w:val="ListParagraph"/>
         <w:numPr>
           <w:ilvl w:val="0"/>
-          <w:numId w:val="2"/>
+          <w:numId w:val="5"/>
         </w:numPr>
-        <w:spacing w:before="40" w:after="40"/>
-        <w:rPr>
-          <w:rFonts w:ascii="Times New Roman" w:hAnsi="Times New Roman" w:cs="Times New Roman"/>
-          <w:sz w:val="22"/>
-          <w:szCs w:val="22"/>
-        </w:rPr>
-      </w:pPr>
-      <w:r>
-        <w:rPr>
-          <w:rFonts w:ascii="Times New Roman" w:eastAsia="Arial" w:hAnsi="Times New Roman" w:cs="Times New Roman"/>
-          <w:sz w:val="22"/>
-          <w:szCs w:val="22"/>
-        </w:rPr>
-        <w:t>Showed hover-based bike/stand data on the map with zero page-load latency.</w:t>
+        <w:pBdr>
+          <w:top w:val="nil"/>
+          <w:left w:val="nil"/>
+          <w:bottom w:val="nil"/>
+          <w:right w:val="nil"/>
+          <w:between w:val="nil"/>
+        </w:pBdr>
+        <w:spacing w:before="60" w:line="276" w:lineRule="auto"/>
+        <w:ind w:right="144"/>
+        <w:rPr>
+          <w:rFonts w:ascii="Times New Roman" w:eastAsia="Times New Roman" w:hAnsi="Times New Roman" w:cs="Times New Roman"/>
+          <w:sz w:val="22"/>
+          <w:szCs w:val="22"/>
+        </w:rPr>
+      </w:pPr>
+      <w:r>
+        <w:rPr>
+          <w:rFonts w:ascii="Times New Roman" w:eastAsia="Times New Roman" w:hAnsi="Times New Roman" w:cs="Times New Roman"/>
+          <w:b/>
+          <w:bCs/>
+          <w:sz w:val="22"/>
+          <w:szCs w:val="22"/>
+        </w:rPr>
+        <w:t>Frontend Data Display</w:t>
+      </w:r>
+      <w:r>
+        <w:rPr>
+          <w:rFonts w:ascii="Times New Roman" w:eastAsia="Times New Roman" w:hAnsi="Times New Roman" w:cs="Times New Roman"/>
+          <w:sz w:val="22"/>
+          <w:szCs w:val="22"/>
+        </w:rPr>
+        <w:t>: Updated the frontend to display available bike and stand data upon hovering over station icons. Data requests are now automatically sent on website load to eliminate display latency.</w:t>
       </w:r>
     </w:p>
     <w:p>
@@ -1468,93 +1397,99 @@
         <w:pStyle w:val="ListParagraph"/>
         <w:numPr>
           <w:ilvl w:val="0"/>
-          <w:numId w:val="2"/>
+          <w:numId w:val="5"/>
         </w:numPr>
-        <w:spacing w:before="40" w:after="40"/>
-        <w:rPr>
-          <w:rFonts w:ascii="Times New Roman" w:hAnsi="Times New Roman" w:cs="Times New Roman"/>
-          <w:sz w:val="22"/>
-          <w:szCs w:val="22"/>
-        </w:rPr>
-      </w:pPr>
-      <w:r>
-        <w:rPr>
-          <w:rFonts w:ascii="Times New Roman" w:eastAsia="Arial" w:hAnsi="Times New Roman" w:cs="Times New Roman"/>
-          <w:sz w:val="22"/>
-          <w:szCs w:val="22"/>
-        </w:rPr>
-        <w:t>Verified Jenkins CI/CD and Docker containerisation for both development and production.</w:t>
-      </w:r>
-    </w:p>
-    <w:p>
-      <w:pPr>
-        <w:rPr>
-          <w:rFonts w:ascii="Times New Roman" w:hAnsi="Times New Roman" w:cs="Times New Roman"/>
-          <w:sz w:val="22"/>
-          <w:szCs w:val="22"/>
-        </w:rPr>
-      </w:pPr>
-    </w:p>
-    <w:p>
-      <w:pPr>
-        <w:pStyle w:val="Heading3"/>
-        <w:rPr>
-          <w:rFonts w:ascii="Times New Roman" w:hAnsi="Times New Roman" w:cs="Times New Roman"/>
-        </w:rPr>
-      </w:pPr>
-      <w:r>
-        <w:rPr>
-          <w:rFonts w:ascii="Times New Roman" w:hAnsi="Times New Roman" w:cs="Times New Roman"/>
-        </w:rPr>
-        <w:t>Sprint Retrospective</w:t>
-      </w:r>
-    </w:p>
-    <w:p>
-      <w:pPr>
-        <w:spacing w:before="60" w:after="60"/>
-        <w:rPr>
-          <w:rFonts w:ascii="Times New Roman" w:hAnsi="Times New Roman" w:cs="Times New Roman"/>
-          <w:sz w:val="22"/>
-          <w:szCs w:val="22"/>
-        </w:rPr>
-      </w:pPr>
-      <w:r>
-        <w:rPr>
-          <w:rFonts w:ascii="Times New Roman" w:eastAsia="Arial" w:hAnsi="Times New Roman" w:cs="Times New Roman"/>
+        <w:pBdr>
+          <w:top w:val="nil"/>
+          <w:left w:val="nil"/>
+          <w:bottom w:val="nil"/>
+          <w:right w:val="nil"/>
+          <w:between w:val="nil"/>
+        </w:pBdr>
+        <w:spacing w:before="60" w:line="276" w:lineRule="auto"/>
+        <w:ind w:right="144"/>
+        <w:rPr>
+          <w:rFonts w:ascii="Times New Roman" w:eastAsia="Times New Roman" w:hAnsi="Times New Roman" w:cs="Times New Roman"/>
+          <w:sz w:val="22"/>
+          <w:szCs w:val="22"/>
+        </w:rPr>
+      </w:pPr>
+      <w:r>
+        <w:rPr>
+          <w:rFonts w:ascii="Times New Roman" w:eastAsia="Times New Roman" w:hAnsi="Times New Roman" w:cs="Times New Roman"/>
           <w:b/>
           <w:bCs/>
           <w:sz w:val="22"/>
           <w:szCs w:val="22"/>
         </w:rPr>
-        <w:t xml:space="preserve">What went well: </w:t>
-      </w:r>
-      <w:r>
+        <w:t>CI/CD &amp; Deployment</w:t>
+      </w:r>
+      <w:r>
+        <w:rPr>
+          <w:rFonts w:ascii="Times New Roman" w:eastAsia="Times New Roman" w:hAnsi="Times New Roman" w:cs="Times New Roman"/>
+          <w:sz w:val="22"/>
+          <w:szCs w:val="22"/>
+        </w:rPr>
+        <w:t>: Verified the continuous integration and deployment process using Jenkins. Confirmed the use of Docker and containerization for a professional, normalized deployment process, keeping the production application updated.</w:t>
+      </w:r>
+    </w:p>
+    <w:p>
+      <w:pPr>
+        <w:pStyle w:val="Heading3"/>
+        <w:rPr>
+          <w:rFonts w:ascii="Times New Roman" w:hAnsi="Times New Roman" w:cs="Times New Roman"/>
+        </w:rPr>
+      </w:pPr>
+    </w:p>
+    <w:p>
+      <w:pPr>
+        <w:pStyle w:val="Heading2"/>
+        <w:rPr>
+          <w:rFonts w:ascii="Times New Roman" w:hAnsi="Times New Roman" w:cs="Times New Roman"/>
+          <w:sz w:val="22"/>
+          <w:szCs w:val="22"/>
+        </w:rPr>
+      </w:pPr>
+      <w:r>
+        <w:rPr>
+          <w:rFonts w:ascii="Times New Roman" w:hAnsi="Times New Roman" w:cs="Times New Roman"/>
+          <w:sz w:val="22"/>
+          <w:szCs w:val="22"/>
+        </w:rPr>
+        <w:t>6.5 Sprint 4 — Machine Learning Integration &amp; System Finalisation</w:t>
+      </w:r>
+    </w:p>
+    <w:p>
+      <w:pPr>
+        <w:pStyle w:val="Heading3"/>
+        <w:rPr>
+          <w:rFonts w:ascii="Times New Roman" w:hAnsi="Times New Roman" w:cs="Times New Roman"/>
+        </w:rPr>
+      </w:pPr>
+      <w:r>
+        <w:rPr>
+          <w:rFonts w:ascii="Times New Roman" w:hAnsi="Times New Roman" w:cs="Times New Roman"/>
+        </w:rPr>
+        <w:t>Implemented Features and Design Decisions</w:t>
+      </w:r>
+    </w:p>
+    <w:p>
+      <w:pPr>
+        <w:spacing w:before="60" w:after="60"/>
         <w:rPr>
           <w:rFonts w:ascii="Times New Roman" w:eastAsia="Arial" w:hAnsi="Times New Roman" w:cs="Times New Roman"/>
           <w:sz w:val="22"/>
           <w:szCs w:val="22"/>
         </w:rPr>
-        <w:t>Core features are working. Frontend and backend integration was smooth and error-free. Development and production environments are correctly configured, and the code-review workflow is operating well.</w:t>
-      </w:r>
-    </w:p>
-    <w:p>
-      <w:pPr>
-        <w:spacing w:before="60" w:after="60"/>
-        <w:rPr>
-          <w:rFonts w:ascii="Times New Roman" w:hAnsi="Times New Roman" w:cs="Times New Roman"/>
-          <w:sz w:val="22"/>
-          <w:szCs w:val="22"/>
-        </w:rPr>
-      </w:pPr>
+      </w:pPr>
+      <w:bookmarkStart w:id="3" w:name="OLE_LINK5"/>
       <w:r>
         <w:rPr>
           <w:rFonts w:ascii="Times New Roman" w:eastAsia="Arial" w:hAnsi="Times New Roman" w:cs="Times New Roman"/>
-          <w:b/>
-          <w:bCs/>
-          <w:sz w:val="22"/>
-          <w:szCs w:val="22"/>
-        </w:rPr>
-        <w:t xml:space="preserve">What could be improved: </w:t>
+          <w:sz w:val="22"/>
+          <w:szCs w:val="22"/>
+        </w:rPr>
+        <w:t xml:space="preserve">A Random Forest model was trained on historical station and weather data, serialised as a .pkl file, and integrated into the Flask backend via a prediction service that preloads the model at startup. The React frontend was updated to fetch and render predictions dynamically, with a brief cold-start latency on the first request acknowledged and documented. UI styling was refined for consistency across all pages. </w:t>
       </w:r>
       <w:r>
         <w:rPr>
@@ -1562,63 +1497,19 @@
           <w:sz w:val="22"/>
           <w:szCs w:val="22"/>
         </w:rPr>
-        <w:t>UI/UX design and colour scheme need further refinement. API keys risk exposure in the browser console, a security concern for production. AI chat output can be interrupted if the user navigates away mid-stream.</w:t>
-      </w:r>
-    </w:p>
-    <w:p>
-      <w:pPr>
-        <w:spacing w:before="60" w:after="60"/>
-        <w:rPr>
-          <w:rFonts w:ascii="Times New Roman" w:hAnsi="Times New Roman" w:cs="Times New Roman"/>
-          <w:sz w:val="22"/>
-          <w:szCs w:val="22"/>
-        </w:rPr>
-      </w:pPr>
-      <w:r>
-        <w:rPr>
-          <w:rFonts w:ascii="Times New Roman" w:eastAsia="Arial" w:hAnsi="Times New Roman" w:cs="Times New Roman"/>
-          <w:b/>
-          <w:bCs/>
-          <w:sz w:val="22"/>
-          <w:szCs w:val="22"/>
-        </w:rPr>
-        <w:t xml:space="preserve">For next sprint: </w:t>
-      </w:r>
-      <w:r>
-        <w:rPr>
-          <w:rFonts w:ascii="Times New Roman" w:eastAsia="Arial" w:hAnsi="Times New Roman" w:cs="Times New Roman"/>
-          <w:sz w:val="22"/>
-          <w:szCs w:val="22"/>
-        </w:rPr>
-        <w:t>Improve UI/UX and colour scheme; fix AI chat response persistence; implement ML-based availability predictions; add unit, integration, and end-to-end tests.</w:t>
-      </w:r>
-    </w:p>
-    <w:p>
-      <w:pPr>
-        <w:rPr>
-          <w:rFonts w:ascii="Times New Roman" w:hAnsi="Times New Roman" w:cs="Times New Roman"/>
-          <w:sz w:val="22"/>
-          <w:szCs w:val="22"/>
-        </w:rPr>
-      </w:pPr>
-    </w:p>
-    <w:p>
-      <w:pPr>
-        <w:pStyle w:val="Heading2"/>
-        <w:rPr>
-          <w:rFonts w:ascii="Times New Roman" w:hAnsi="Times New Roman" w:cs="Times New Roman"/>
-          <w:sz w:val="22"/>
-          <w:szCs w:val="22"/>
-        </w:rPr>
-      </w:pPr>
-      <w:r>
-        <w:rPr>
-          <w:rFonts w:ascii="Times New Roman" w:hAnsi="Times New Roman" w:cs="Times New Roman"/>
-          <w:sz w:val="22"/>
-          <w:szCs w:val="22"/>
-        </w:rPr>
-        <w:t>6.5 Sprint 4 — Machine Learning Integration &amp; System Finalisation</w:t>
-      </w:r>
+        <w:lastRenderedPageBreak/>
+        <w:t>Backend test coverage reached 97% with pytest, and the CI/CD pipeline was updated to download ML artefacts from Hugging Face Hub during the build stage.</w:t>
+      </w:r>
+    </w:p>
+    <w:bookmarkEnd w:id="3"/>
+    <w:p>
+      <w:pPr>
+        <w:rPr>
+          <w:rFonts w:ascii="Times New Roman" w:hAnsi="Times New Roman" w:cs="Times New Roman"/>
+          <w:sz w:val="22"/>
+          <w:szCs w:val="22"/>
+        </w:rPr>
+      </w:pPr>
     </w:p>
     <w:p>
       <w:pPr>
@@ -1631,56 +1522,14 @@
         <w:rPr>
           <w:rFonts w:ascii="Times New Roman" w:hAnsi="Times New Roman" w:cs="Times New Roman"/>
         </w:rPr>
-        <w:lastRenderedPageBreak/>
-        <w:t>Implemented Features and Design Decisions</w:t>
-      </w:r>
-    </w:p>
-    <w:p>
-      <w:pPr>
-        <w:spacing w:before="60" w:after="60"/>
-        <w:rPr>
-          <w:rFonts w:ascii="Times New Roman" w:hAnsi="Times New Roman" w:cs="Times New Roman"/>
-          <w:sz w:val="22"/>
-          <w:szCs w:val="22"/>
-        </w:rPr>
-      </w:pPr>
-      <w:r>
-        <w:rPr>
-          <w:rFonts w:ascii="Times New Roman" w:eastAsia="Arial" w:hAnsi="Times New Roman" w:cs="Times New Roman"/>
-          <w:sz w:val="22"/>
-          <w:szCs w:val="22"/>
-        </w:rPr>
-        <w:t>A Random Forest model was trained on historical station and weather data, serialised as a .pkl file, and integrated into the Flask backend via a prediction service that preloads the model at startup. The React frontend was updated to fetch and render predictions dynamically, with a brief cold-start latency on the first request acknowledged and documented. UI styling was refined for consistency across all pages. Backend test coverage reached 97% with pytest, and the CI/CD pipeline was updated to download ML artefacts from Hugging Face Hub during the build stage.</w:t>
-      </w:r>
-    </w:p>
-    <w:p>
-      <w:pPr>
-        <w:rPr>
-          <w:rFonts w:ascii="Times New Roman" w:hAnsi="Times New Roman" w:cs="Times New Roman"/>
-          <w:sz w:val="22"/>
-          <w:szCs w:val="22"/>
-        </w:rPr>
-      </w:pPr>
+        <w:t>Burndown Chart</w:t>
+      </w:r>
     </w:p>
     <w:p>
       <w:pPr>
         <w:pStyle w:val="Heading3"/>
         <w:rPr>
           <w:rFonts w:ascii="Times New Roman" w:hAnsi="Times New Roman" w:cs="Times New Roman"/>
-        </w:rPr>
-      </w:pPr>
-      <w:r>
-        <w:rPr>
-          <w:rFonts w:ascii="Times New Roman" w:hAnsi="Times New Roman" w:cs="Times New Roman"/>
-        </w:rPr>
-        <w:t>Burndown Chart</w:t>
-      </w:r>
-    </w:p>
-    <w:p>
-      <w:pPr>
-        <w:pStyle w:val="Heading3"/>
-        <w:rPr>
-          <w:rFonts w:ascii="Times New Roman" w:hAnsi="Times New Roman" w:cs="Times New Roman" w:hint="eastAsia"/>
         </w:rPr>
       </w:pPr>
       <w:r>
@@ -1733,20 +1582,24 @@
     </w:p>
     <w:p>
       <w:pPr>
-        <w:spacing w:before="60" w:after="60"/>
-        <w:rPr>
-          <w:rFonts w:ascii="Times New Roman" w:hAnsi="Times New Roman" w:cs="Times New Roman"/>
-          <w:sz w:val="22"/>
-          <w:szCs w:val="22"/>
-        </w:rPr>
-      </w:pPr>
-      <w:r>
-        <w:rPr>
-          <w:rFonts w:ascii="Times New Roman" w:eastAsia="Arial" w:hAnsi="Times New Roman" w:cs="Times New Roman"/>
-          <w:sz w:val="22"/>
-          <w:szCs w:val="22"/>
-        </w:rPr>
-        <w:t>Points Remaining stayed slightly above the Ideal Trend line during Days 3–5 as the team focused on ML fine-tuning and API formatting issues. A steep drop on Day 7 restored velocity, and all tasks were completed on Day 9, one day before the deadline.</w:t>
+        <w:spacing w:before="240" w:after="240"/>
+        <w:rPr>
+          <w:rFonts w:ascii="Times New Roman" w:hAnsi="Times New Roman" w:cs="Times New Roman"/>
+          <w:color w:val="1F1F1F"/>
+          <w:sz w:val="22"/>
+          <w:szCs w:val="22"/>
+          <w:highlight w:val="white"/>
+        </w:rPr>
+      </w:pPr>
+      <w:r>
+        <w:rPr>
+          <w:rFonts w:ascii="Times New Roman" w:hAnsi="Times New Roman" w:cs="Times New Roman"/>
+          <w:color w:val="1F1F1F"/>
+          <w:sz w:val="22"/>
+          <w:szCs w:val="22"/>
+          <w:highlight w:val="white"/>
+        </w:rPr>
+        <w:t>The Burndown chart illustrates a steady progression with a few plateaus, reflecting the complexity of our final integration tasks. Our "Points Remaining" line stayed slightly above the "Available" trend line during the middle of the sprint (Days 3-5) as the team was deeply involved in fine-tuning the machine learning algorithms and resolving frontend-backend API formatting issues. However, following a steep drop around Day 7, we regained our high velocity and successfully reached zero remaining tasks on Day 9, one day before the sprint deadline. This efficient completion allowed us to dedicate the final day strictly to code refactoring, ensuring UI consistency, and compiling our final project report.</w:t>
       </w:r>
     </w:p>
     <w:p>
@@ -1774,163 +1627,170 @@
     </w:p>
     <w:p>
       <w:pPr>
-        <w:pStyle w:val="ListParagraph"/>
         <w:numPr>
           <w:ilvl w:val="0"/>
-          <w:numId w:val="2"/>
+          <w:numId w:val="6"/>
         </w:numPr>
-        <w:spacing w:before="40" w:after="40"/>
-        <w:rPr>
-          <w:rFonts w:ascii="Times New Roman" w:hAnsi="Times New Roman" w:cs="Times New Roman"/>
-          <w:sz w:val="22"/>
-          <w:szCs w:val="22"/>
-        </w:rPr>
-      </w:pPr>
-      <w:r>
-        <w:rPr>
-          <w:rFonts w:ascii="Times New Roman" w:eastAsia="Arial" w:hAnsi="Times New Roman" w:cs="Times New Roman"/>
-          <w:sz w:val="22"/>
-          <w:szCs w:val="22"/>
-        </w:rPr>
-        <w:t>Demonstrated the fully integrated web application: React frontend → Flask backend → ML predictions rendered live.</w:t>
-      </w:r>
-    </w:p>
-    <w:p>
-      <w:pPr>
-        <w:pStyle w:val="ListParagraph"/>
+        <w:spacing w:before="60" w:line="276" w:lineRule="auto"/>
+        <w:rPr>
+          <w:rFonts w:ascii="Times New Roman" w:hAnsi="Times New Roman" w:cs="Times New Roman"/>
+          <w:color w:val="1F1F1F"/>
+          <w:sz w:val="22"/>
+          <w:szCs w:val="22"/>
+          <w:highlight w:val="white"/>
+        </w:rPr>
+      </w:pPr>
+      <w:r>
+        <w:rPr>
+          <w:rFonts w:ascii="Times New Roman" w:hAnsi="Times New Roman" w:cs="Times New Roman"/>
+          <w:b/>
+          <w:bCs/>
+          <w:color w:val="1F1F1F"/>
+          <w:sz w:val="22"/>
+          <w:szCs w:val="22"/>
+          <w:highlight w:val="white"/>
+        </w:rPr>
+        <w:t>Application Demonstration:</w:t>
+      </w:r>
+      <w:r>
+        <w:rPr>
+          <w:rFonts w:ascii="Times New Roman" w:hAnsi="Times New Roman" w:cs="Times New Roman"/>
+          <w:color w:val="1F1F1F"/>
+          <w:sz w:val="22"/>
+          <w:szCs w:val="22"/>
+          <w:highlight w:val="white"/>
+        </w:rPr>
+        <w:t xml:space="preserve"> Presented the fully functional web application, showcasing the seamless integration between the React frontend and Flask backend. We demonstrated the refined UI styling, highlighting how the consistent design provides a smooth user experience across all pages.</w:t>
+      </w:r>
+    </w:p>
+    <w:p>
+      <w:pPr>
         <w:numPr>
           <w:ilvl w:val="0"/>
-          <w:numId w:val="2"/>
+          <w:numId w:val="6"/>
         </w:numPr>
-        <w:spacing w:before="40" w:after="40"/>
-        <w:rPr>
-          <w:rFonts w:ascii="Times New Roman" w:hAnsi="Times New Roman" w:cs="Times New Roman"/>
-          <w:sz w:val="22"/>
-          <w:szCs w:val="22"/>
-        </w:rPr>
-      </w:pPr>
-      <w:r>
-        <w:rPr>
-          <w:rFonts w:ascii="Times New Roman" w:eastAsia="Arial" w:hAnsi="Times New Roman" w:cs="Times New Roman"/>
-          <w:sz w:val="22"/>
-          <w:szCs w:val="22"/>
-        </w:rPr>
-        <w:t>Explained cold-start latency on first prediction request and confirmed fast performance on subsequent requests.</w:t>
-      </w:r>
-    </w:p>
-    <w:p>
-      <w:pPr>
-        <w:pStyle w:val="ListParagraph"/>
+        <w:spacing w:before="60" w:line="276" w:lineRule="auto"/>
+        <w:rPr>
+          <w:rFonts w:ascii="Times New Roman" w:hAnsi="Times New Roman" w:cs="Times New Roman"/>
+          <w:color w:val="1F1F1F"/>
+          <w:sz w:val="22"/>
+          <w:szCs w:val="22"/>
+          <w:highlight w:val="white"/>
+        </w:rPr>
+      </w:pPr>
+      <w:r>
+        <w:rPr>
+          <w:rFonts w:ascii="Times New Roman" w:hAnsi="Times New Roman" w:cs="Times New Roman"/>
+          <w:b/>
+          <w:bCs/>
+          <w:color w:val="1F1F1F"/>
+          <w:sz w:val="22"/>
+          <w:szCs w:val="22"/>
+          <w:highlight w:val="white"/>
+        </w:rPr>
+        <w:t>Machine Learning Verification:</w:t>
+      </w:r>
+      <w:r>
+        <w:rPr>
+          <w:rFonts w:ascii="Times New Roman" w:hAnsi="Times New Roman" w:cs="Times New Roman"/>
+          <w:color w:val="1F1F1F"/>
+          <w:sz w:val="22"/>
+          <w:szCs w:val="22"/>
+          <w:highlight w:val="white"/>
+        </w:rPr>
+        <w:t xml:space="preserve"> Demonstrated the live predictive feature powered by our </w:t>
+      </w:r>
+      <w:proofErr w:type="gramStart"/>
+      <w:r>
+        <w:rPr>
+          <w:rFonts w:ascii="Times New Roman" w:hAnsi="Times New Roman" w:cs="Times New Roman"/>
+          <w:color w:val="1F1F1F"/>
+          <w:sz w:val="22"/>
+          <w:szCs w:val="22"/>
+          <w:highlight w:val="white"/>
+        </w:rPr>
+        <w:t xml:space="preserve">exported </w:t>
+      </w:r>
+      <w:r>
+        <w:rPr>
+          <w:rFonts w:ascii="Times New Roman" w:eastAsia="Roboto Mono" w:hAnsi="Times New Roman" w:cs="Times New Roman"/>
+          <w:color w:val="188038"/>
+          <w:sz w:val="22"/>
+          <w:szCs w:val="22"/>
+          <w:highlight w:val="white"/>
+        </w:rPr>
+        <w:t>.pkl</w:t>
+      </w:r>
+      <w:proofErr w:type="gramEnd"/>
+      <w:r>
+        <w:rPr>
+          <w:rFonts w:ascii="Times New Roman" w:hAnsi="Times New Roman" w:cs="Times New Roman"/>
+          <w:color w:val="1F1F1F"/>
+          <w:sz w:val="22"/>
+          <w:szCs w:val="22"/>
+          <w:highlight w:val="white"/>
+        </w:rPr>
+        <w:t xml:space="preserve"> model. We showed how the frontend fetches data from the backend API and dynamically renders the prediction results. We also explained the slight "cold start" latency during the first click and proved the fast, seamless performance of all subsequent requests.</w:t>
+      </w:r>
+    </w:p>
+    <w:p>
+      <w:pPr>
         <w:numPr>
           <w:ilvl w:val="0"/>
-          <w:numId w:val="2"/>
+          <w:numId w:val="6"/>
         </w:numPr>
-        <w:spacing w:before="40" w:after="40"/>
-        <w:rPr>
-          <w:rFonts w:ascii="Times New Roman" w:hAnsi="Times New Roman" w:cs="Times New Roman"/>
-          <w:sz w:val="22"/>
-          <w:szCs w:val="22"/>
-        </w:rPr>
-      </w:pPr>
-      <w:r>
-        <w:rPr>
-          <w:rFonts w:ascii="Times New Roman" w:eastAsia="Arial" w:hAnsi="Times New Roman" w:cs="Times New Roman"/>
-          <w:sz w:val="22"/>
-          <w:szCs w:val="22"/>
-        </w:rPr>
-        <w:t xml:space="preserve">Highlighted </w:t>
-      </w:r>
-      <w:proofErr w:type="gramStart"/>
-      <w:r>
-        <w:rPr>
-          <w:rFonts w:ascii="Times New Roman" w:eastAsia="Arial" w:hAnsi="Times New Roman" w:cs="Times New Roman"/>
-          <w:sz w:val="22"/>
-          <w:szCs w:val="22"/>
-        </w:rPr>
-        <w:t>97% unit</w:t>
-      </w:r>
-      <w:proofErr w:type="gramEnd"/>
-      <w:r>
-        <w:rPr>
-          <w:rFonts w:ascii="Times New Roman" w:eastAsia="Arial" w:hAnsi="Times New Roman" w:cs="Times New Roman"/>
-          <w:sz w:val="22"/>
-          <w:szCs w:val="22"/>
-        </w:rPr>
-        <w:t xml:space="preserve"> test coverage as evidence of system reliability.</w:t>
-      </w:r>
-    </w:p>
-    <w:p>
-      <w:pPr>
-        <w:pStyle w:val="ListParagraph"/>
-        <w:numPr>
-          <w:ilvl w:val="0"/>
-          <w:numId w:val="2"/>
-        </w:numPr>
-        <w:spacing w:before="40" w:after="40"/>
-        <w:rPr>
-          <w:rFonts w:ascii="Times New Roman" w:hAnsi="Times New Roman" w:cs="Times New Roman"/>
-          <w:sz w:val="22"/>
-          <w:szCs w:val="22"/>
-        </w:rPr>
-      </w:pPr>
-      <w:r>
-        <w:rPr>
-          <w:rFonts w:ascii="Times New Roman" w:eastAsia="Arial" w:hAnsi="Times New Roman" w:cs="Times New Roman"/>
-          <w:sz w:val="22"/>
-          <w:szCs w:val="22"/>
-        </w:rPr>
-        <w:t>Agreed final phase will focus on code refactoring, UI/UX polish, and report compilation.</w:t>
-      </w:r>
-    </w:p>
-    <w:p>
-      <w:pPr>
-        <w:rPr>
-          <w:rFonts w:ascii="Times New Roman" w:hAnsi="Times New Roman" w:cs="Times New Roman"/>
-          <w:sz w:val="22"/>
-          <w:szCs w:val="22"/>
-        </w:rPr>
-      </w:pPr>
-    </w:p>
-    <w:p>
-      <w:pPr>
-        <w:pStyle w:val="Heading3"/>
-        <w:rPr>
-          <w:rFonts w:ascii="Times New Roman" w:hAnsi="Times New Roman" w:cs="Times New Roman"/>
-        </w:rPr>
-      </w:pPr>
-      <w:r>
-        <w:rPr>
-          <w:rFonts w:ascii="Times New Roman" w:hAnsi="Times New Roman" w:cs="Times New Roman"/>
-        </w:rPr>
-        <w:t>Sprint Retrospective</w:t>
-      </w:r>
-    </w:p>
-    <w:p>
-      <w:pPr>
-        <w:spacing w:before="60" w:after="60"/>
-        <w:rPr>
-          <w:rFonts w:ascii="Times New Roman" w:hAnsi="Times New Roman" w:cs="Times New Roman"/>
-          <w:sz w:val="22"/>
-          <w:szCs w:val="22"/>
-        </w:rPr>
-      </w:pPr>
-      <w:r>
-        <w:rPr>
-          <w:rFonts w:ascii="Times New Roman" w:eastAsia="Arial" w:hAnsi="Times New Roman" w:cs="Times New Roman"/>
+        <w:spacing w:before="60" w:line="276" w:lineRule="auto"/>
+        <w:rPr>
+          <w:rFonts w:ascii="Times New Roman" w:hAnsi="Times New Roman" w:cs="Times New Roman"/>
+          <w:color w:val="1F1F1F"/>
+          <w:sz w:val="22"/>
+          <w:szCs w:val="22"/>
+          <w:highlight w:val="white"/>
+        </w:rPr>
+      </w:pPr>
+      <w:r>
+        <w:rPr>
+          <w:rFonts w:ascii="Times New Roman" w:hAnsi="Times New Roman" w:cs="Times New Roman"/>
           <w:b/>
           <w:bCs/>
-          <w:sz w:val="22"/>
-          <w:szCs w:val="22"/>
-        </w:rPr>
-        <w:t xml:space="preserve">What went well: </w:t>
-      </w:r>
-      <w:r>
-        <w:rPr>
-          <w:rFonts w:ascii="Times New Roman" w:eastAsia="Arial" w:hAnsi="Times New Roman" w:cs="Times New Roman"/>
-          <w:sz w:val="22"/>
-          <w:szCs w:val="22"/>
-        </w:rPr>
-        <w:t>The full ML pipeline — data cleaning, feature selection, model training, export, and Flask integration — was delivered successfully. React UI components were implemented and styled consistently. 97% test coverage was achieved, confirming system robustness.</w:t>
+          <w:color w:val="1F1F1F"/>
+          <w:sz w:val="22"/>
+          <w:szCs w:val="22"/>
+          <w:highlight w:val="white"/>
+        </w:rPr>
+        <w:t>Quality Assurance &amp; Next Steps:</w:t>
+      </w:r>
+      <w:r>
+        <w:rPr>
+          <w:rFonts w:ascii="Times New Roman" w:hAnsi="Times New Roman" w:cs="Times New Roman"/>
+          <w:color w:val="1F1F1F"/>
+          <w:sz w:val="22"/>
+          <w:szCs w:val="22"/>
+          <w:highlight w:val="white"/>
+        </w:rPr>
+        <w:t xml:space="preserve"> Highlighted our achievement of </w:t>
+      </w:r>
+      <w:proofErr w:type="gramStart"/>
+      <w:r>
+        <w:rPr>
+          <w:rFonts w:ascii="Times New Roman" w:hAnsi="Times New Roman" w:cs="Times New Roman"/>
+          <w:color w:val="1F1F1F"/>
+          <w:sz w:val="22"/>
+          <w:szCs w:val="22"/>
+          <w:highlight w:val="white"/>
+        </w:rPr>
+        <w:t>97% unit</w:t>
+      </w:r>
+      <w:proofErr w:type="gramEnd"/>
+      <w:r>
+        <w:rPr>
+          <w:rFonts w:ascii="Times New Roman" w:hAnsi="Times New Roman" w:cs="Times New Roman"/>
+          <w:color w:val="1F1F1F"/>
+          <w:sz w:val="22"/>
+          <w:szCs w:val="22"/>
+          <w:highlight w:val="white"/>
+        </w:rPr>
+        <w:t xml:space="preserve"> test coverage, proving the stability and reliability of our codebase. Since all core development is now complete, we discussed our strategy for the final 2-week phase, agreeing to focus strictly on code refactoring, UI/UX beautification, and compiling the final project report.</w:t>
       </w:r>
     </w:p>
     <w:p>
@@ -1942,64 +1802,6 @@
           <w:szCs w:val="22"/>
         </w:rPr>
       </w:pPr>
-      <w:r>
-        <w:rPr>
-          <w:rFonts w:ascii="Times New Roman" w:eastAsia="Arial" w:hAnsi="Times New Roman" w:cs="Times New Roman"/>
-          <w:b/>
-          <w:bCs/>
-          <w:sz w:val="22"/>
-          <w:szCs w:val="22"/>
-        </w:rPr>
-        <w:t xml:space="preserve">What could be improved: </w:t>
-      </w:r>
-      <w:r>
-        <w:rPr>
-          <w:rFonts w:ascii="Times New Roman" w:eastAsia="Arial" w:hAnsi="Times New Roman" w:cs="Times New Roman"/>
-          <w:sz w:val="22"/>
-          <w:szCs w:val="22"/>
-        </w:rPr>
-        <w:t>Algorithm comparison and hyperparameter tuning took longer than planned. Minor API formatting issues during frontend–backend integration required extra debugging effort. Cold-start prediction latency was identified as a known limitation.</w:t>
-      </w:r>
-    </w:p>
-    <w:p>
-      <w:pPr>
-        <w:spacing w:before="60" w:after="60"/>
-        <w:rPr>
-          <w:rFonts w:ascii="Times New Roman" w:hAnsi="Times New Roman" w:cs="Times New Roman"/>
-          <w:sz w:val="22"/>
-          <w:szCs w:val="22"/>
-        </w:rPr>
-      </w:pPr>
-      <w:proofErr w:type="gramStart"/>
-      <w:r>
-        <w:rPr>
-          <w:rFonts w:ascii="Times New Roman" w:eastAsia="Arial" w:hAnsi="Times New Roman" w:cs="Times New Roman"/>
-          <w:b/>
-          <w:bCs/>
-          <w:sz w:val="22"/>
-          <w:szCs w:val="22"/>
-        </w:rPr>
-        <w:t>Final conclusion</w:t>
-      </w:r>
-      <w:proofErr w:type="gramEnd"/>
-      <w:r>
-        <w:rPr>
-          <w:rFonts w:ascii="Times New Roman" w:eastAsia="Arial" w:hAnsi="Times New Roman" w:cs="Times New Roman"/>
-          <w:b/>
-          <w:bCs/>
-          <w:sz w:val="22"/>
-          <w:szCs w:val="22"/>
-        </w:rPr>
-        <w:t xml:space="preserve">: </w:t>
-      </w:r>
-      <w:r>
-        <w:rPr>
-          <w:rFonts w:ascii="Times New Roman" w:eastAsia="Arial" w:hAnsi="Times New Roman" w:cs="Times New Roman"/>
-          <w:sz w:val="22"/>
-          <w:szCs w:val="22"/>
-        </w:rPr>
-        <w:t>All core development tasks are complete. Data scraping, the Flask backend, the React frontend, and ML predictions have been successfully integrated into a fully functional web application.</w:t>
-      </w:r>
     </w:p>
     <w:sectPr>
       <w:pgSz w:w="11906" w:h="16838"/>
@@ -2014,6 +1816,318 @@
 <file path=word/numbering.xml><?xml version="1.0" encoding="utf-8"?>
 <w:numbering xmlns:wpc="http://schemas.microsoft.com/office/word/2010/wordprocessingCanvas" xmlns:cx="http://schemas.microsoft.com/office/drawing/2014/chartex" xmlns:cx1="http://schemas.microsoft.com/office/drawing/2015/9/8/chartex" xmlns:cx2="http://schemas.microsoft.com/office/drawing/2015/10/21/chartex" xmlns:cx3="http://schemas.microsoft.com/office/drawing/2016/5/9/chartex" xmlns:cx4="http://schemas.microsoft.com/office/drawing/2016/5/10/chartex" xmlns:cx5="http://schemas.microsoft.com/office/drawing/2016/5/11/chartex" xmlns:cx6="http://schemas.microsoft.com/office/drawing/2016/5/12/chartex" xmlns:cx7="http://schemas.microsoft.com/office/drawing/2016/5/13/chartex" xmlns:cx8="http://schemas.microsoft.com/office/drawing/2016/5/14/chartex" xmlns:mc="http://schemas.openxmlformats.org/markup-compatibility/2006" xmlns:aink="http://schemas.microsoft.com/office/drawing/2016/ink" xmlns:am3d="http://schemas.microsoft.com/office/drawing/2017/model3d" xmlns:o="urn:schemas-microsoft-com:office:office" xmlns:oel="http://schemas.microsoft.com/office/2019/extlst" xmlns:r="http://schemas.openxmlformats.org/officeDocument/2006/relationships" xmlns:m="http://schemas.openxmlformats.org/officeDocument/2006/math" xmlns:v="urn:schemas-microsoft-com:vml" xmlns:wp14="http://schemas.microsoft.com/office/word/2010/wordprocessingDrawing" xmlns:wp="http://schemas.openxmlformats.org/drawingml/2006/wordprocessingDrawing" xmlns:w10="urn:schemas-microsoft-com:office:word" xmlns:w="http://schemas.openxmlformats.org/wordprocessingml/2006/main" xmlns:w14="http://schemas.microsoft.com/office/word/2010/wordml" xmlns:w15="http://schemas.microsoft.com/office/word/2012/wordml" xmlns:w16cex="http://schemas.microsoft.com/office/word/2018/wordml/cex" xmlns:w16cid="http://schemas.microsoft.com/office/word/2016/wordml/cid" xmlns:w16="http://schemas.microsoft.com/office/word/2018/wordml" xmlns:w16du="http://schemas.microsoft.com/office/word/2023/wordml/word16du" xmlns:w16sdtdh="http://schemas.microsoft.com/office/word/2020/wordml/sdtdatahash" xmlns:w16sdtfl="http://schemas.microsoft.com/office/word/2024/wordml/sdtformatlock" xmlns:w16se="http://schemas.microsoft.com/office/word/2015/wordml/symex" xmlns:wpg="http://schemas.microsoft.com/office/word/2010/wordprocessingGroup" xmlns:wpi="http://schemas.microsoft.com/office/word/2010/wordprocessingInk" xmlns:wne="http://schemas.microsoft.com/office/word/2006/wordml" xmlns:wps="http://schemas.microsoft.com/office/word/2010/wordprocessingShape" mc:Ignorable="w14 w15 w16se w16cid w16 w16cex w16sdtdh w16sdtfl w16du wp14">
   <w:abstractNum w:abstractNumId="0" w15:restartNumberingAfterBreak="0">
+    <w:nsid w:val="0A2F703E"/>
+    <w:multiLevelType w:val="hybridMultilevel"/>
+    <w:tmpl w:val="7AD827A2"/>
+    <w:lvl w:ilvl="0" w:tplc="0409000F">
+      <w:start w:val="1"/>
+      <w:numFmt w:val="decimal"/>
+      <w:lvlText w:val="%1."/>
+      <w:lvlJc w:val="left"/>
+      <w:pPr>
+        <w:ind w:left="720" w:hanging="360"/>
+      </w:pPr>
+    </w:lvl>
+    <w:lvl w:ilvl="1" w:tplc="04090019" w:tentative="1">
+      <w:start w:val="1"/>
+      <w:numFmt w:val="lowerLetter"/>
+      <w:lvlText w:val="%2."/>
+      <w:lvlJc w:val="left"/>
+      <w:pPr>
+        <w:ind w:left="1440" w:hanging="360"/>
+      </w:pPr>
+    </w:lvl>
+    <w:lvl w:ilvl="2" w:tplc="0409001B" w:tentative="1">
+      <w:start w:val="1"/>
+      <w:numFmt w:val="lowerRoman"/>
+      <w:lvlText w:val="%3."/>
+      <w:lvlJc w:val="right"/>
+      <w:pPr>
+        <w:ind w:left="2160" w:hanging="180"/>
+      </w:pPr>
+    </w:lvl>
+    <w:lvl w:ilvl="3" w:tplc="0409000F" w:tentative="1">
+      <w:start w:val="1"/>
+      <w:numFmt w:val="decimal"/>
+      <w:lvlText w:val="%4."/>
+      <w:lvlJc w:val="left"/>
+      <w:pPr>
+        <w:ind w:left="2880" w:hanging="360"/>
+      </w:pPr>
+    </w:lvl>
+    <w:lvl w:ilvl="4" w:tplc="04090019" w:tentative="1">
+      <w:start w:val="1"/>
+      <w:numFmt w:val="lowerLetter"/>
+      <w:lvlText w:val="%5."/>
+      <w:lvlJc w:val="left"/>
+      <w:pPr>
+        <w:ind w:left="3600" w:hanging="360"/>
+      </w:pPr>
+    </w:lvl>
+    <w:lvl w:ilvl="5" w:tplc="0409001B" w:tentative="1">
+      <w:start w:val="1"/>
+      <w:numFmt w:val="lowerRoman"/>
+      <w:lvlText w:val="%6."/>
+      <w:lvlJc w:val="right"/>
+      <w:pPr>
+        <w:ind w:left="4320" w:hanging="180"/>
+      </w:pPr>
+    </w:lvl>
+    <w:lvl w:ilvl="6" w:tplc="0409000F" w:tentative="1">
+      <w:start w:val="1"/>
+      <w:numFmt w:val="decimal"/>
+      <w:lvlText w:val="%7."/>
+      <w:lvlJc w:val="left"/>
+      <w:pPr>
+        <w:ind w:left="5040" w:hanging="360"/>
+      </w:pPr>
+    </w:lvl>
+    <w:lvl w:ilvl="7" w:tplc="04090019" w:tentative="1">
+      <w:start w:val="1"/>
+      <w:numFmt w:val="lowerLetter"/>
+      <w:lvlText w:val="%8."/>
+      <w:lvlJc w:val="left"/>
+      <w:pPr>
+        <w:ind w:left="5760" w:hanging="360"/>
+      </w:pPr>
+    </w:lvl>
+    <w:lvl w:ilvl="8" w:tplc="0409001B" w:tentative="1">
+      <w:start w:val="1"/>
+      <w:numFmt w:val="lowerRoman"/>
+      <w:lvlText w:val="%9."/>
+      <w:lvlJc w:val="right"/>
+      <w:pPr>
+        <w:ind w:left="6480" w:hanging="180"/>
+      </w:pPr>
+    </w:lvl>
+  </w:abstractNum>
+  <w:abstractNum w:abstractNumId="1" w15:restartNumberingAfterBreak="0">
+    <w:nsid w:val="17C467BD"/>
+    <w:multiLevelType w:val="multilevel"/>
+    <w:tmpl w:val="01B27B00"/>
+    <w:lvl w:ilvl="0">
+      <w:start w:val="1"/>
+      <w:numFmt w:val="decimal"/>
+      <w:lvlText w:val="%1."/>
+      <w:lvlJc w:val="left"/>
+      <w:pPr>
+        <w:ind w:left="720" w:hanging="360"/>
+      </w:pPr>
+      <w:rPr>
+        <w:u w:val="none"/>
+      </w:rPr>
+    </w:lvl>
+    <w:lvl w:ilvl="1">
+      <w:start w:val="1"/>
+      <w:numFmt w:val="lowerLetter"/>
+      <w:lvlText w:val="%2."/>
+      <w:lvlJc w:val="left"/>
+      <w:pPr>
+        <w:ind w:left="1440" w:hanging="360"/>
+      </w:pPr>
+      <w:rPr>
+        <w:u w:val="none"/>
+      </w:rPr>
+    </w:lvl>
+    <w:lvl w:ilvl="2">
+      <w:start w:val="1"/>
+      <w:numFmt w:val="lowerRoman"/>
+      <w:lvlText w:val="%3."/>
+      <w:lvlJc w:val="right"/>
+      <w:pPr>
+        <w:ind w:left="2160" w:hanging="360"/>
+      </w:pPr>
+      <w:rPr>
+        <w:u w:val="none"/>
+      </w:rPr>
+    </w:lvl>
+    <w:lvl w:ilvl="3">
+      <w:start w:val="1"/>
+      <w:numFmt w:val="decimal"/>
+      <w:lvlText w:val="%4."/>
+      <w:lvlJc w:val="left"/>
+      <w:pPr>
+        <w:ind w:left="2880" w:hanging="360"/>
+      </w:pPr>
+      <w:rPr>
+        <w:u w:val="none"/>
+      </w:rPr>
+    </w:lvl>
+    <w:lvl w:ilvl="4">
+      <w:start w:val="1"/>
+      <w:numFmt w:val="lowerLetter"/>
+      <w:lvlText w:val="%5."/>
+      <w:lvlJc w:val="left"/>
+      <w:pPr>
+        <w:ind w:left="3600" w:hanging="360"/>
+      </w:pPr>
+      <w:rPr>
+        <w:u w:val="none"/>
+      </w:rPr>
+    </w:lvl>
+    <w:lvl w:ilvl="5">
+      <w:start w:val="1"/>
+      <w:numFmt w:val="lowerRoman"/>
+      <w:lvlText w:val="%6."/>
+      <w:lvlJc w:val="right"/>
+      <w:pPr>
+        <w:ind w:left="4320" w:hanging="360"/>
+      </w:pPr>
+      <w:rPr>
+        <w:u w:val="none"/>
+      </w:rPr>
+    </w:lvl>
+    <w:lvl w:ilvl="6">
+      <w:start w:val="1"/>
+      <w:numFmt w:val="decimal"/>
+      <w:lvlText w:val="%7."/>
+      <w:lvlJc w:val="left"/>
+      <w:pPr>
+        <w:ind w:left="5040" w:hanging="360"/>
+      </w:pPr>
+      <w:rPr>
+        <w:u w:val="none"/>
+      </w:rPr>
+    </w:lvl>
+    <w:lvl w:ilvl="7">
+      <w:start w:val="1"/>
+      <w:numFmt w:val="lowerLetter"/>
+      <w:lvlText w:val="%8."/>
+      <w:lvlJc w:val="left"/>
+      <w:pPr>
+        <w:ind w:left="5760" w:hanging="360"/>
+      </w:pPr>
+      <w:rPr>
+        <w:u w:val="none"/>
+      </w:rPr>
+    </w:lvl>
+    <w:lvl w:ilvl="8">
+      <w:start w:val="1"/>
+      <w:numFmt w:val="lowerRoman"/>
+      <w:lvlText w:val="%9."/>
+      <w:lvlJc w:val="right"/>
+      <w:pPr>
+        <w:ind w:left="6480" w:hanging="360"/>
+      </w:pPr>
+      <w:rPr>
+        <w:u w:val="none"/>
+      </w:rPr>
+    </w:lvl>
+  </w:abstractNum>
+  <w:abstractNum w:abstractNumId="2" w15:restartNumberingAfterBreak="0">
+    <w:nsid w:val="3E00543D"/>
+    <w:multiLevelType w:val="multilevel"/>
+    <w:tmpl w:val="F4947680"/>
+    <w:lvl w:ilvl="0">
+      <w:start w:val="1"/>
+      <w:numFmt w:val="decimal"/>
+      <w:lvlText w:val="%1."/>
+      <w:lvlJc w:val="left"/>
+      <w:pPr>
+        <w:ind w:left="720" w:hanging="360"/>
+      </w:pPr>
+      <w:rPr>
+        <w:u w:val="none"/>
+      </w:rPr>
+    </w:lvl>
+    <w:lvl w:ilvl="1">
+      <w:start w:val="1"/>
+      <w:numFmt w:val="lowerLetter"/>
+      <w:lvlText w:val="%2."/>
+      <w:lvlJc w:val="left"/>
+      <w:pPr>
+        <w:ind w:left="1440" w:hanging="360"/>
+      </w:pPr>
+      <w:rPr>
+        <w:u w:val="none"/>
+      </w:rPr>
+    </w:lvl>
+    <w:lvl w:ilvl="2">
+      <w:start w:val="1"/>
+      <w:numFmt w:val="lowerRoman"/>
+      <w:lvlText w:val="%3."/>
+      <w:lvlJc w:val="left"/>
+      <w:pPr>
+        <w:ind w:left="2160" w:hanging="360"/>
+      </w:pPr>
+      <w:rPr>
+        <w:u w:val="none"/>
+      </w:rPr>
+    </w:lvl>
+    <w:lvl w:ilvl="3">
+      <w:start w:val="1"/>
+      <w:numFmt w:val="decimal"/>
+      <w:lvlText w:val="%4."/>
+      <w:lvlJc w:val="left"/>
+      <w:pPr>
+        <w:ind w:left="2880" w:hanging="360"/>
+      </w:pPr>
+      <w:rPr>
+        <w:u w:val="none"/>
+      </w:rPr>
+    </w:lvl>
+    <w:lvl w:ilvl="4">
+      <w:start w:val="1"/>
+      <w:numFmt w:val="lowerLetter"/>
+      <w:lvlText w:val="%5."/>
+      <w:lvlJc w:val="left"/>
+      <w:pPr>
+        <w:ind w:left="3600" w:hanging="360"/>
+      </w:pPr>
+      <w:rPr>
+        <w:u w:val="none"/>
+      </w:rPr>
+    </w:lvl>
+    <w:lvl w:ilvl="5">
+      <w:start w:val="1"/>
+      <w:numFmt w:val="lowerRoman"/>
+      <w:lvlText w:val="%6."/>
+      <w:lvlJc w:val="left"/>
+      <w:pPr>
+        <w:ind w:left="4320" w:hanging="360"/>
+      </w:pPr>
+      <w:rPr>
+        <w:u w:val="none"/>
+      </w:rPr>
+    </w:lvl>
+    <w:lvl w:ilvl="6">
+      <w:start w:val="1"/>
+      <w:numFmt w:val="decimal"/>
+      <w:lvlText w:val="%7."/>
+      <w:lvlJc w:val="left"/>
+      <w:pPr>
+        <w:ind w:left="5040" w:hanging="360"/>
+      </w:pPr>
+      <w:rPr>
+        <w:u w:val="none"/>
+      </w:rPr>
+    </w:lvl>
+    <w:lvl w:ilvl="7">
+      <w:start w:val="1"/>
+      <w:numFmt w:val="lowerLetter"/>
+      <w:lvlText w:val="%8."/>
+      <w:lvlJc w:val="left"/>
+      <w:pPr>
+        <w:ind w:left="5760" w:hanging="360"/>
+      </w:pPr>
+      <w:rPr>
+        <w:u w:val="none"/>
+      </w:rPr>
+    </w:lvl>
+    <w:lvl w:ilvl="8">
+      <w:start w:val="1"/>
+      <w:numFmt w:val="lowerRoman"/>
+      <w:lvlText w:val="%9."/>
+      <w:lvlJc w:val="left"/>
+      <w:pPr>
+        <w:ind w:left="6480" w:hanging="360"/>
+      </w:pPr>
+      <w:rPr>
+        <w:u w:val="none"/>
+      </w:rPr>
+    </w:lvl>
+  </w:abstractNum>
+  <w:abstractNum w:abstractNumId="3" w15:restartNumberingAfterBreak="0">
     <w:nsid w:val="3E480960"/>
     <w:multiLevelType w:val="hybridMultilevel"/>
     <w:tmpl w:val="A56CA62E"/>
@@ -2067,7 +2181,7 @@
       <w:lvlJc w:val="left"/>
     </w:lvl>
   </w:abstractNum>
-  <w:abstractNum w:abstractNumId="1" w15:restartNumberingAfterBreak="0">
+  <w:abstractNum w:abstractNumId="4" w15:restartNumberingAfterBreak="0">
     <w:nsid w:val="6462590C"/>
     <w:multiLevelType w:val="hybridMultilevel"/>
     <w:tmpl w:val="BBF64B3A"/>
@@ -2153,17 +2267,115 @@
       </w:pPr>
     </w:lvl>
   </w:abstractNum>
+  <w:abstractNum w:abstractNumId="5" w15:restartNumberingAfterBreak="0">
+    <w:nsid w:val="7B111933"/>
+    <w:multiLevelType w:val="hybridMultilevel"/>
+    <w:tmpl w:val="E8FCAA26"/>
+    <w:lvl w:ilvl="0" w:tplc="0409000F">
+      <w:start w:val="1"/>
+      <w:numFmt w:val="decimal"/>
+      <w:lvlText w:val="%1."/>
+      <w:lvlJc w:val="left"/>
+      <w:pPr>
+        <w:ind w:left="720" w:hanging="360"/>
+      </w:pPr>
+    </w:lvl>
+    <w:lvl w:ilvl="1" w:tplc="04090019" w:tentative="1">
+      <w:start w:val="1"/>
+      <w:numFmt w:val="lowerLetter"/>
+      <w:lvlText w:val="%2."/>
+      <w:lvlJc w:val="left"/>
+      <w:pPr>
+        <w:ind w:left="1440" w:hanging="360"/>
+      </w:pPr>
+    </w:lvl>
+    <w:lvl w:ilvl="2" w:tplc="0409001B" w:tentative="1">
+      <w:start w:val="1"/>
+      <w:numFmt w:val="lowerRoman"/>
+      <w:lvlText w:val="%3."/>
+      <w:lvlJc w:val="right"/>
+      <w:pPr>
+        <w:ind w:left="2160" w:hanging="180"/>
+      </w:pPr>
+    </w:lvl>
+    <w:lvl w:ilvl="3" w:tplc="0409000F" w:tentative="1">
+      <w:start w:val="1"/>
+      <w:numFmt w:val="decimal"/>
+      <w:lvlText w:val="%4."/>
+      <w:lvlJc w:val="left"/>
+      <w:pPr>
+        <w:ind w:left="2880" w:hanging="360"/>
+      </w:pPr>
+    </w:lvl>
+    <w:lvl w:ilvl="4" w:tplc="04090019" w:tentative="1">
+      <w:start w:val="1"/>
+      <w:numFmt w:val="lowerLetter"/>
+      <w:lvlText w:val="%5."/>
+      <w:lvlJc w:val="left"/>
+      <w:pPr>
+        <w:ind w:left="3600" w:hanging="360"/>
+      </w:pPr>
+    </w:lvl>
+    <w:lvl w:ilvl="5" w:tplc="0409001B" w:tentative="1">
+      <w:start w:val="1"/>
+      <w:numFmt w:val="lowerRoman"/>
+      <w:lvlText w:val="%6."/>
+      <w:lvlJc w:val="right"/>
+      <w:pPr>
+        <w:ind w:left="4320" w:hanging="180"/>
+      </w:pPr>
+    </w:lvl>
+    <w:lvl w:ilvl="6" w:tplc="0409000F" w:tentative="1">
+      <w:start w:val="1"/>
+      <w:numFmt w:val="decimal"/>
+      <w:lvlText w:val="%7."/>
+      <w:lvlJc w:val="left"/>
+      <w:pPr>
+        <w:ind w:left="5040" w:hanging="360"/>
+      </w:pPr>
+    </w:lvl>
+    <w:lvl w:ilvl="7" w:tplc="04090019" w:tentative="1">
+      <w:start w:val="1"/>
+      <w:numFmt w:val="lowerLetter"/>
+      <w:lvlText w:val="%8."/>
+      <w:lvlJc w:val="left"/>
+      <w:pPr>
+        <w:ind w:left="5760" w:hanging="360"/>
+      </w:pPr>
+    </w:lvl>
+    <w:lvl w:ilvl="8" w:tplc="0409001B" w:tentative="1">
+      <w:start w:val="1"/>
+      <w:numFmt w:val="lowerRoman"/>
+      <w:lvlText w:val="%9."/>
+      <w:lvlJc w:val="right"/>
+      <w:pPr>
+        <w:ind w:left="6480" w:hanging="180"/>
+      </w:pPr>
+    </w:lvl>
+  </w:abstractNum>
   <w:num w:numId="1" w16cid:durableId="1451558578">
-    <w:abstractNumId w:val="1"/>
+    <w:abstractNumId w:val="4"/>
     <w:lvlOverride w:ilvl="0">
       <w:startOverride w:val="1"/>
     </w:lvlOverride>
   </w:num>
   <w:num w:numId="2" w16cid:durableId="1524593222">
-    <w:abstractNumId w:val="0"/>
+    <w:abstractNumId w:val="3"/>
     <w:lvlOverride w:ilvl="0">
       <w:startOverride w:val="1"/>
     </w:lvlOverride>
+  </w:num>
+  <w:num w:numId="3" w16cid:durableId="498540456">
+    <w:abstractNumId w:val="2"/>
+  </w:num>
+  <w:num w:numId="4" w16cid:durableId="670184914">
+    <w:abstractNumId w:val="5"/>
+  </w:num>
+  <w:num w:numId="5" w16cid:durableId="1538464606">
+    <w:abstractNumId w:val="0"/>
+  </w:num>
+  <w:num w:numId="6" w16cid:durableId="43607402">
+    <w:abstractNumId w:val="1"/>
   </w:num>
 </w:numbering>
 </file>

</xml_diff>

<commit_message>
updated final report file
</commit_message>
<xml_diff>
--- a/6.docx
+++ b/6.docx
@@ -4,7 +4,7 @@
   <w:body>
     <w:p>
       <w:pPr>
-        <w:pStyle w:val="Heading1"/>
+        <w:pStyle w:val="1"/>
         <w:rPr>
           <w:rFonts w:ascii="Times New Roman" w:hAnsi="Times New Roman" w:cs="Times New Roman"/>
           <w:sz w:val="22"/>
@@ -31,20 +31,38 @@
     </w:p>
     <w:p>
       <w:pPr>
-        <w:pStyle w:val="Heading2"/>
-        <w:rPr>
-          <w:rFonts w:ascii="Times New Roman" w:hAnsi="Times New Roman" w:cs="Times New Roman"/>
-          <w:sz w:val="22"/>
-          <w:szCs w:val="22"/>
-        </w:rPr>
-      </w:pPr>
-      <w:r>
-        <w:rPr>
-          <w:rFonts w:ascii="Times New Roman" w:hAnsi="Times New Roman" w:cs="Times New Roman"/>
-          <w:sz w:val="22"/>
-          <w:szCs w:val="22"/>
-        </w:rPr>
-        <w:t>6.1 Project Organisation and Tools</w:t>
+        <w:pStyle w:val="2"/>
+        <w:rPr>
+          <w:rFonts w:ascii="Times New Roman" w:hAnsi="Times New Roman" w:cs="Times New Roman"/>
+          <w:sz w:val="22"/>
+          <w:szCs w:val="22"/>
+        </w:rPr>
+      </w:pPr>
+      <w:r>
+        <w:rPr>
+          <w:rFonts w:ascii="Times New Roman" w:hAnsi="Times New Roman" w:cs="Times New Roman"/>
+          <w:sz w:val="22"/>
+          <w:szCs w:val="22"/>
+        </w:rPr>
+        <w:t xml:space="preserve">6.1 Project </w:t>
+      </w:r>
+      <w:proofErr w:type="spellStart"/>
+      <w:r>
+        <w:rPr>
+          <w:rFonts w:ascii="Times New Roman" w:hAnsi="Times New Roman" w:cs="Times New Roman"/>
+          <w:sz w:val="22"/>
+          <w:szCs w:val="22"/>
+        </w:rPr>
+        <w:t>Organisation</w:t>
+      </w:r>
+      <w:proofErr w:type="spellEnd"/>
+      <w:r>
+        <w:rPr>
+          <w:rFonts w:ascii="Times New Roman" w:hAnsi="Times New Roman" w:cs="Times New Roman"/>
+          <w:sz w:val="22"/>
+          <w:szCs w:val="22"/>
+        </w:rPr>
+        <w:t xml:space="preserve"> and Tools</w:t>
       </w:r>
     </w:p>
     <w:p>
@@ -239,7 +257,25 @@
                 <w:sz w:val="22"/>
                 <w:szCs w:val="22"/>
               </w:rPr>
-              <w:t>REST API (Flask/Gunicorn), JWT auth, ML predictions, journey planning, AI chat. Owns the MySQL schema via Flask-Migrate.</w:t>
+              <w:t>REST API (Flask/</w:t>
+            </w:r>
+            <w:proofErr w:type="spellStart"/>
+            <w:r>
+              <w:rPr>
+                <w:rFonts w:ascii="Times New Roman" w:eastAsia="Arial" w:hAnsi="Times New Roman" w:cs="Times New Roman"/>
+                <w:sz w:val="22"/>
+                <w:szCs w:val="22"/>
+              </w:rPr>
+              <w:t>Gunicorn</w:t>
+            </w:r>
+            <w:proofErr w:type="spellEnd"/>
+            <w:r>
+              <w:rPr>
+                <w:rFonts w:ascii="Times New Roman" w:eastAsia="Arial" w:hAnsi="Times New Roman" w:cs="Times New Roman"/>
+                <w:sz w:val="22"/>
+                <w:szCs w:val="22"/>
+              </w:rPr>
+              <w:t>), JWT auth, ML predictions, journey planning, AI chat. Owns the MySQL schema via Flask-Migrate.</w:t>
             </w:r>
           </w:p>
         </w:tc>
@@ -379,7 +415,25 @@
                 <w:sz w:val="22"/>
                 <w:szCs w:val="22"/>
               </w:rPr>
-              <w:t>Long-running Python process: polls JCDecaux stations and OpenWeatherMap forecasts, writing to the shared database.</w:t>
+              <w:t xml:space="preserve">Long-running Python process: polls JCDecaux stations and </w:t>
+            </w:r>
+            <w:proofErr w:type="spellStart"/>
+            <w:r>
+              <w:rPr>
+                <w:rFonts w:ascii="Times New Roman" w:eastAsia="Arial" w:hAnsi="Times New Roman" w:cs="Times New Roman"/>
+                <w:sz w:val="22"/>
+                <w:szCs w:val="22"/>
+              </w:rPr>
+              <w:t>OpenWeatherMap</w:t>
+            </w:r>
+            <w:proofErr w:type="spellEnd"/>
+            <w:r>
+              <w:rPr>
+                <w:rFonts w:ascii="Times New Roman" w:eastAsia="Arial" w:hAnsi="Times New Roman" w:cs="Times New Roman"/>
+                <w:sz w:val="22"/>
+                <w:szCs w:val="22"/>
+              </w:rPr>
+              <w:t xml:space="preserve"> forecasts, writing to the shared database.</w:t>
             </w:r>
           </w:p>
         </w:tc>
@@ -419,7 +473,43 @@
           <w:sz w:val="22"/>
           <w:szCs w:val="22"/>
         </w:rPr>
-        <w:t>Git feature-branch workflow • Jenkins (Kubernetes agent) • Docker • AWS EC2 • pytest (≈97 % coverage) • ESLint / TypeScript • Discord (team communication).</w:t>
+        <w:t xml:space="preserve">Git feature-branch workflow • Jenkins (Kubernetes agent) • Docker • AWS EC2 • </w:t>
+      </w:r>
+      <w:proofErr w:type="spellStart"/>
+      <w:r>
+        <w:rPr>
+          <w:rFonts w:ascii="Times New Roman" w:eastAsia="Arial" w:hAnsi="Times New Roman" w:cs="Times New Roman"/>
+          <w:sz w:val="22"/>
+          <w:szCs w:val="22"/>
+        </w:rPr>
+        <w:t>pytest</w:t>
+      </w:r>
+      <w:proofErr w:type="spellEnd"/>
+      <w:r>
+        <w:rPr>
+          <w:rFonts w:ascii="Times New Roman" w:eastAsia="Arial" w:hAnsi="Times New Roman" w:cs="Times New Roman"/>
+          <w:sz w:val="22"/>
+          <w:szCs w:val="22"/>
+        </w:rPr>
+        <w:t xml:space="preserve"> (≈97 % coverage) • </w:t>
+      </w:r>
+      <w:proofErr w:type="spellStart"/>
+      <w:r>
+        <w:rPr>
+          <w:rFonts w:ascii="Times New Roman" w:eastAsia="Arial" w:hAnsi="Times New Roman" w:cs="Times New Roman"/>
+          <w:sz w:val="22"/>
+          <w:szCs w:val="22"/>
+        </w:rPr>
+        <w:t>ESLint</w:t>
+      </w:r>
+      <w:proofErr w:type="spellEnd"/>
+      <w:r>
+        <w:rPr>
+          <w:rFonts w:ascii="Times New Roman" w:eastAsia="Arial" w:hAnsi="Times New Roman" w:cs="Times New Roman"/>
+          <w:sz w:val="22"/>
+          <w:szCs w:val="22"/>
+        </w:rPr>
+        <w:t xml:space="preserve"> / TypeScript • Discord (team communication).</w:t>
       </w:r>
     </w:p>
     <w:p>
@@ -447,21 +537,39 @@
           <w:sz w:val="22"/>
           <w:szCs w:val="22"/>
         </w:rPr>
-        <w:t>Both flask-app and scraper share one DATABASE_URL. Flask-Migrate migrations must run first. In development, Vite proxies /api to Flask on port 5000; in production a reverse proxy handles the same routing.</w:t>
-      </w:r>
-    </w:p>
-    <w:p>
-      <w:pPr>
-        <w:rPr>
-          <w:rFonts w:ascii="Times New Roman" w:hAnsi="Times New Roman" w:cs="Times New Roman"/>
-          <w:sz w:val="22"/>
-          <w:szCs w:val="22"/>
-        </w:rPr>
-      </w:pPr>
-    </w:p>
-    <w:p>
-      <w:pPr>
-        <w:pStyle w:val="Heading2"/>
+        <w:t>Both flask-app and scraper share one DATABASE_URL. Flask-Migrate migrations must run first. In development, Vite proxies /</w:t>
+      </w:r>
+      <w:proofErr w:type="spellStart"/>
+      <w:r>
+        <w:rPr>
+          <w:rFonts w:ascii="Times New Roman" w:eastAsia="Arial" w:hAnsi="Times New Roman" w:cs="Times New Roman"/>
+          <w:sz w:val="22"/>
+          <w:szCs w:val="22"/>
+        </w:rPr>
+        <w:t>api</w:t>
+      </w:r>
+      <w:proofErr w:type="spellEnd"/>
+      <w:r>
+        <w:rPr>
+          <w:rFonts w:ascii="Times New Roman" w:eastAsia="Arial" w:hAnsi="Times New Roman" w:cs="Times New Roman"/>
+          <w:sz w:val="22"/>
+          <w:szCs w:val="22"/>
+        </w:rPr>
+        <w:t xml:space="preserve"> to Flask on port 5000; in production a reverse proxy handles the same routing.</w:t>
+      </w:r>
+    </w:p>
+    <w:p>
+      <w:pPr>
+        <w:rPr>
+          <w:rFonts w:ascii="Times New Roman" w:hAnsi="Times New Roman" w:cs="Times New Roman"/>
+          <w:sz w:val="22"/>
+          <w:szCs w:val="22"/>
+        </w:rPr>
+      </w:pPr>
+    </w:p>
+    <w:p>
+      <w:pPr>
+        <w:pStyle w:val="2"/>
         <w:rPr>
           <w:rFonts w:ascii="Times New Roman" w:hAnsi="Times New Roman" w:cs="Times New Roman"/>
           <w:sz w:val="22"/>
@@ -479,7 +587,7 @@
     </w:p>
     <w:p>
       <w:pPr>
-        <w:pStyle w:val="Heading3"/>
+        <w:pStyle w:val="3"/>
         <w:rPr>
           <w:rFonts w:ascii="Times New Roman" w:hAnsi="Times New Roman" w:cs="Times New Roman"/>
         </w:rPr>
@@ -507,7 +615,25 @@
           <w:sz w:val="22"/>
           <w:szCs w:val="22"/>
         </w:rPr>
-        <w:t>The team conducted user interviews to validate three personas (Student, Professional, Tourist), produced Figma UI mockups, and defined user stories. On the technical side, a MySQL database schema was established and scraping scripts for the JCDecaux and OpenWeatherMap APIs were written and deployed. A 5-minute scrape interval was chosen as the design default to balance data freshness against API rate limits. The scraper ran stably throughout the sprint, consistently populating the database and providing a reliable foundation for subsequent development.</w:t>
+        <w:t xml:space="preserve">The team conducted user interviews to validate three personas (Student, Professional, Tourist), produced Figma UI mockups, and defined user stories. On the technical side, a MySQL database schema was established and scraping scripts for the JCDecaux and </w:t>
+      </w:r>
+      <w:proofErr w:type="spellStart"/>
+      <w:r>
+        <w:rPr>
+          <w:rFonts w:ascii="Times New Roman" w:eastAsia="Arial" w:hAnsi="Times New Roman" w:cs="Times New Roman"/>
+          <w:sz w:val="22"/>
+          <w:szCs w:val="22"/>
+        </w:rPr>
+        <w:t>OpenWeatherMap</w:t>
+      </w:r>
+      <w:proofErr w:type="spellEnd"/>
+      <w:r>
+        <w:rPr>
+          <w:rFonts w:ascii="Times New Roman" w:eastAsia="Arial" w:hAnsi="Times New Roman" w:cs="Times New Roman"/>
+          <w:sz w:val="22"/>
+          <w:szCs w:val="22"/>
+        </w:rPr>
+        <w:t xml:space="preserve"> APIs were written and deployed. A 5-minute scrape interval was chosen as the design default to balance data freshness against API rate limits. The scraper ran stably throughout the sprint, consistently populating the database and providing a reliable foundation for subsequent development.</w:t>
       </w:r>
     </w:p>
     <w:bookmarkEnd w:id="0"/>
@@ -522,7 +648,7 @@
     </w:p>
     <w:p>
       <w:pPr>
-        <w:pStyle w:val="Heading3"/>
+        <w:pStyle w:val="3"/>
         <w:rPr>
           <w:rFonts w:ascii="Times New Roman" w:hAnsi="Times New Roman" w:cs="Times New Roman"/>
         </w:rPr>
@@ -536,7 +662,7 @@
     </w:p>
     <w:p>
       <w:pPr>
-        <w:pStyle w:val="Heading3"/>
+        <w:pStyle w:val="3"/>
         <w:rPr>
           <w:rFonts w:ascii="Times New Roman" w:hAnsi="Times New Roman" w:cs="Times New Roman"/>
         </w:rPr>
@@ -631,7 +757,7 @@
     </w:p>
     <w:p>
       <w:pPr>
-        <w:pStyle w:val="Heading3"/>
+        <w:pStyle w:val="3"/>
         <w:rPr>
           <w:rFonts w:ascii="Times New Roman" w:hAnsi="Times New Roman" w:cs="Times New Roman"/>
         </w:rPr>
@@ -771,7 +897,7 @@
     </w:p>
     <w:p>
       <w:pPr>
-        <w:pStyle w:val="Heading2"/>
+        <w:pStyle w:val="2"/>
         <w:rPr>
           <w:rFonts w:ascii="Times New Roman" w:hAnsi="Times New Roman" w:cs="Times New Roman"/>
           <w:sz w:val="22"/>
@@ -789,7 +915,7 @@
     </w:p>
     <w:p>
       <w:pPr>
-        <w:pStyle w:val="Heading3"/>
+        <w:pStyle w:val="3"/>
         <w:rPr>
           <w:rFonts w:ascii="Times New Roman" w:hAnsi="Times New Roman" w:cs="Times New Roman"/>
         </w:rPr>
@@ -832,7 +958,7 @@
     </w:p>
     <w:p>
       <w:pPr>
-        <w:pStyle w:val="Heading3"/>
+        <w:pStyle w:val="3"/>
         <w:rPr>
           <w:rFonts w:ascii="Times New Roman" w:hAnsi="Times New Roman" w:cs="Times New Roman"/>
         </w:rPr>
@@ -846,7 +972,7 @@
     </w:p>
     <w:p>
       <w:pPr>
-        <w:pStyle w:val="Heading3"/>
+        <w:pStyle w:val="3"/>
         <w:rPr>
           <w:rFonts w:ascii="Times New Roman" w:hAnsi="Times New Roman" w:cs="Times New Roman"/>
         </w:rPr>
@@ -927,7 +1053,7 @@
     </w:p>
     <w:p>
       <w:pPr>
-        <w:pStyle w:val="Heading3"/>
+        <w:pStyle w:val="3"/>
         <w:rPr>
           <w:rFonts w:ascii="Times New Roman" w:hAnsi="Times New Roman" w:cs="Times New Roman"/>
         </w:rPr>
@@ -941,7 +1067,7 @@
     </w:p>
     <w:p>
       <w:pPr>
-        <w:pStyle w:val="ListParagraph"/>
+        <w:pStyle w:val="a4"/>
         <w:numPr>
           <w:ilvl w:val="0"/>
           <w:numId w:val="4"/>
@@ -974,7 +1100,7 @@
     </w:p>
     <w:p>
       <w:pPr>
-        <w:pStyle w:val="ListParagraph"/>
+        <w:pStyle w:val="a4"/>
         <w:numPr>
           <w:ilvl w:val="0"/>
           <w:numId w:val="4"/>
@@ -1007,7 +1133,7 @@
     </w:p>
     <w:p>
       <w:pPr>
-        <w:pStyle w:val="ListParagraph"/>
+        <w:pStyle w:val="a4"/>
         <w:numPr>
           <w:ilvl w:val="0"/>
           <w:numId w:val="4"/>
@@ -1040,7 +1166,7 @@
     </w:p>
     <w:p>
       <w:pPr>
-        <w:pStyle w:val="ListParagraph"/>
+        <w:pStyle w:val="a4"/>
         <w:numPr>
           <w:ilvl w:val="0"/>
           <w:numId w:val="4"/>
@@ -1092,7 +1218,7 @@
     </w:p>
     <w:p>
       <w:pPr>
-        <w:pStyle w:val="Heading2"/>
+        <w:pStyle w:val="2"/>
         <w:rPr>
           <w:rFonts w:ascii="Times New Roman" w:hAnsi="Times New Roman" w:cs="Times New Roman"/>
           <w:sz w:val="22"/>
@@ -1110,7 +1236,7 @@
     </w:p>
     <w:p>
       <w:pPr>
-        <w:pStyle w:val="Heading3"/>
+        <w:pStyle w:val="3"/>
         <w:rPr>
           <w:rFonts w:ascii="Times New Roman" w:hAnsi="Times New Roman" w:cs="Times New Roman"/>
         </w:rPr>
@@ -1138,7 +1264,61 @@
           <w:sz w:val="22"/>
           <w:szCs w:val="22"/>
         </w:rPr>
-        <w:t>Three AI chat features were implemented using the Langchain framework and the Aliyun Qwen API, with chat history persisted in new database tables and displayed on login. The React frontend was updated to show available bike and stand counts on station hover, and data is now pre-fetched on page load to eliminate display latency. The database was migrated from a local instance to Amazon RDS to overcome EC2 memory constraints and improve query performance. The CI/CD pipeline was verified end-to-end with Docker containerisation confirming a stable, reproducible deployment process.</w:t>
+        <w:t xml:space="preserve">Three AI chat features were implemented using the </w:t>
+      </w:r>
+      <w:proofErr w:type="spellStart"/>
+      <w:r>
+        <w:rPr>
+          <w:rFonts w:ascii="Times New Roman" w:eastAsia="Arial" w:hAnsi="Times New Roman" w:cs="Times New Roman"/>
+          <w:sz w:val="22"/>
+          <w:szCs w:val="22"/>
+        </w:rPr>
+        <w:t>Langchain</w:t>
+      </w:r>
+      <w:proofErr w:type="spellEnd"/>
+      <w:r>
+        <w:rPr>
+          <w:rFonts w:ascii="Times New Roman" w:eastAsia="Arial" w:hAnsi="Times New Roman" w:cs="Times New Roman"/>
+          <w:sz w:val="22"/>
+          <w:szCs w:val="22"/>
+        </w:rPr>
+        <w:t xml:space="preserve"> framework and the </w:t>
+      </w:r>
+      <w:proofErr w:type="spellStart"/>
+      <w:r>
+        <w:rPr>
+          <w:rFonts w:ascii="Times New Roman" w:eastAsia="Arial" w:hAnsi="Times New Roman" w:cs="Times New Roman"/>
+          <w:sz w:val="22"/>
+          <w:szCs w:val="22"/>
+        </w:rPr>
+        <w:t>Aliyun</w:t>
+      </w:r>
+      <w:proofErr w:type="spellEnd"/>
+      <w:r>
+        <w:rPr>
+          <w:rFonts w:ascii="Times New Roman" w:eastAsia="Arial" w:hAnsi="Times New Roman" w:cs="Times New Roman"/>
+          <w:sz w:val="22"/>
+          <w:szCs w:val="22"/>
+        </w:rPr>
+        <w:t xml:space="preserve"> Qwen API, with chat history persisted in new database tables and displayed on login. The React frontend was updated to show available bike and stand counts on station hover, and data is now pre-fetched on page load to eliminate display latency. The database was migrated from a local instance to Amazon RDS to overcome EC2 memory constraints and improve query performance. The CI/CD pipeline was verified end-to-end with Docker </w:t>
+      </w:r>
+      <w:proofErr w:type="spellStart"/>
+      <w:r>
+        <w:rPr>
+          <w:rFonts w:ascii="Times New Roman" w:eastAsia="Arial" w:hAnsi="Times New Roman" w:cs="Times New Roman"/>
+          <w:sz w:val="22"/>
+          <w:szCs w:val="22"/>
+        </w:rPr>
+        <w:t>containerisation</w:t>
+      </w:r>
+      <w:proofErr w:type="spellEnd"/>
+      <w:r>
+        <w:rPr>
+          <w:rFonts w:ascii="Times New Roman" w:eastAsia="Arial" w:hAnsi="Times New Roman" w:cs="Times New Roman"/>
+          <w:sz w:val="22"/>
+          <w:szCs w:val="22"/>
+        </w:rPr>
+        <w:t xml:space="preserve"> confirming a stable, reproducible deployment process.</w:t>
       </w:r>
     </w:p>
     <w:bookmarkEnd w:id="2"/>
@@ -1153,7 +1333,7 @@
     </w:p>
     <w:p>
       <w:pPr>
-        <w:pStyle w:val="Heading3"/>
+        <w:pStyle w:val="3"/>
         <w:rPr>
           <w:rFonts w:ascii="Times New Roman" w:hAnsi="Times New Roman" w:cs="Times New Roman"/>
         </w:rPr>
@@ -1167,7 +1347,7 @@
     </w:p>
     <w:p>
       <w:pPr>
-        <w:pStyle w:val="Heading3"/>
+        <w:pStyle w:val="3"/>
         <w:rPr>
           <w:rFonts w:ascii="Times New Roman" w:hAnsi="Times New Roman" w:cs="Times New Roman"/>
         </w:rPr>
@@ -1249,15 +1429,15 @@
     <w:p>
       <w:pPr>
         <w:rPr>
-          <w:rFonts w:ascii="Times New Roman" w:hAnsi="Times New Roman" w:cs="Times New Roman" w:hint="eastAsia"/>
-          <w:sz w:val="22"/>
-          <w:szCs w:val="22"/>
-        </w:rPr>
-      </w:pPr>
-    </w:p>
-    <w:p>
-      <w:pPr>
-        <w:pStyle w:val="Heading3"/>
+          <w:rFonts w:ascii="Times New Roman" w:hAnsi="Times New Roman" w:cs="Times New Roman"/>
+          <w:sz w:val="22"/>
+          <w:szCs w:val="22"/>
+        </w:rPr>
+      </w:pPr>
+    </w:p>
+    <w:p>
+      <w:pPr>
+        <w:pStyle w:val="3"/>
         <w:rPr>
           <w:rFonts w:ascii="Times New Roman" w:hAnsi="Times New Roman" w:cs="Times New Roman"/>
         </w:rPr>
@@ -1271,7 +1451,7 @@
     </w:p>
     <w:p>
       <w:pPr>
-        <w:pStyle w:val="ListParagraph"/>
+        <w:pStyle w:val="a4"/>
         <w:numPr>
           <w:ilvl w:val="0"/>
           <w:numId w:val="5"/>
@@ -1307,12 +1487,48 @@
           <w:sz w:val="22"/>
           <w:szCs w:val="22"/>
         </w:rPr>
-        <w:t>: Successfully implemented the three core AI features using the Langchain framework and Aliyun API. Demonstrating chat history storage and LLM memory through new database tables, with chat history displayed upon user login.</w:t>
-      </w:r>
-    </w:p>
-    <w:p>
-      <w:pPr>
-        <w:pStyle w:val="ListParagraph"/>
+        <w:t xml:space="preserve">: Successfully implemented the three core AI features using the </w:t>
+      </w:r>
+      <w:proofErr w:type="spellStart"/>
+      <w:r>
+        <w:rPr>
+          <w:rFonts w:ascii="Times New Roman" w:eastAsia="Times New Roman" w:hAnsi="Times New Roman" w:cs="Times New Roman"/>
+          <w:sz w:val="22"/>
+          <w:szCs w:val="22"/>
+        </w:rPr>
+        <w:t>Langchain</w:t>
+      </w:r>
+      <w:proofErr w:type="spellEnd"/>
+      <w:r>
+        <w:rPr>
+          <w:rFonts w:ascii="Times New Roman" w:eastAsia="Times New Roman" w:hAnsi="Times New Roman" w:cs="Times New Roman"/>
+          <w:sz w:val="22"/>
+          <w:szCs w:val="22"/>
+        </w:rPr>
+        <w:t xml:space="preserve"> framework and </w:t>
+      </w:r>
+      <w:proofErr w:type="spellStart"/>
+      <w:r>
+        <w:rPr>
+          <w:rFonts w:ascii="Times New Roman" w:eastAsia="Times New Roman" w:hAnsi="Times New Roman" w:cs="Times New Roman"/>
+          <w:sz w:val="22"/>
+          <w:szCs w:val="22"/>
+        </w:rPr>
+        <w:t>Aliyun</w:t>
+      </w:r>
+      <w:proofErr w:type="spellEnd"/>
+      <w:r>
+        <w:rPr>
+          <w:rFonts w:ascii="Times New Roman" w:eastAsia="Times New Roman" w:hAnsi="Times New Roman" w:cs="Times New Roman"/>
+          <w:sz w:val="22"/>
+          <w:szCs w:val="22"/>
+        </w:rPr>
+        <w:t xml:space="preserve"> API. Demonstrating chat history storage and LLM memory through new database tables, with chat history displayed upon user login.</w:t>
+      </w:r>
+    </w:p>
+    <w:p>
+      <w:pPr>
+        <w:pStyle w:val="a4"/>
         <w:numPr>
           <w:ilvl w:val="0"/>
           <w:numId w:val="5"/>
@@ -1353,7 +1569,7 @@
     </w:p>
     <w:p>
       <w:pPr>
-        <w:pStyle w:val="ListParagraph"/>
+        <w:pStyle w:val="a4"/>
         <w:numPr>
           <w:ilvl w:val="0"/>
           <w:numId w:val="5"/>
@@ -1394,7 +1610,7 @@
     </w:p>
     <w:p>
       <w:pPr>
-        <w:pStyle w:val="ListParagraph"/>
+        <w:pStyle w:val="a4"/>
         <w:numPr>
           <w:ilvl w:val="0"/>
           <w:numId w:val="5"/>
@@ -1435,33 +1651,43 @@
     </w:p>
     <w:p>
       <w:pPr>
-        <w:pStyle w:val="Heading3"/>
-        <w:rPr>
-          <w:rFonts w:ascii="Times New Roman" w:hAnsi="Times New Roman" w:cs="Times New Roman"/>
-        </w:rPr>
-      </w:pPr>
-    </w:p>
-    <w:p>
-      <w:pPr>
-        <w:pStyle w:val="Heading2"/>
-        <w:rPr>
-          <w:rFonts w:ascii="Times New Roman" w:hAnsi="Times New Roman" w:cs="Times New Roman"/>
-          <w:sz w:val="22"/>
-          <w:szCs w:val="22"/>
-        </w:rPr>
-      </w:pPr>
-      <w:r>
-        <w:rPr>
-          <w:rFonts w:ascii="Times New Roman" w:hAnsi="Times New Roman" w:cs="Times New Roman"/>
-          <w:sz w:val="22"/>
-          <w:szCs w:val="22"/>
-        </w:rPr>
-        <w:t>6.5 Sprint 4 — Machine Learning Integration &amp; System Finalisation</w:t>
-      </w:r>
-    </w:p>
-    <w:p>
-      <w:pPr>
-        <w:pStyle w:val="Heading3"/>
+        <w:pStyle w:val="3"/>
+        <w:rPr>
+          <w:rFonts w:ascii="Times New Roman" w:hAnsi="Times New Roman" w:cs="Times New Roman"/>
+        </w:rPr>
+      </w:pPr>
+    </w:p>
+    <w:p>
+      <w:pPr>
+        <w:pStyle w:val="2"/>
+        <w:rPr>
+          <w:rFonts w:ascii="Times New Roman" w:hAnsi="Times New Roman" w:cs="Times New Roman"/>
+          <w:sz w:val="22"/>
+          <w:szCs w:val="22"/>
+        </w:rPr>
+      </w:pPr>
+      <w:r>
+        <w:rPr>
+          <w:rFonts w:ascii="Times New Roman" w:hAnsi="Times New Roman" w:cs="Times New Roman"/>
+          <w:sz w:val="22"/>
+          <w:szCs w:val="22"/>
+        </w:rPr>
+        <w:t xml:space="preserve">6.5 Sprint 4 — Machine Learning Integration &amp; System </w:t>
+      </w:r>
+      <w:proofErr w:type="spellStart"/>
+      <w:r>
+        <w:rPr>
+          <w:rFonts w:ascii="Times New Roman" w:hAnsi="Times New Roman" w:cs="Times New Roman"/>
+          <w:sz w:val="22"/>
+          <w:szCs w:val="22"/>
+        </w:rPr>
+        <w:t>Finalisation</w:t>
+      </w:r>
+      <w:proofErr w:type="spellEnd"/>
+    </w:p>
+    <w:p>
+      <w:pPr>
+        <w:pStyle w:val="3"/>
         <w:rPr>
           <w:rFonts w:ascii="Times New Roman" w:hAnsi="Times New Roman" w:cs="Times New Roman"/>
         </w:rPr>
@@ -1489,7 +1715,7 @@
           <w:sz w:val="22"/>
           <w:szCs w:val="22"/>
         </w:rPr>
-        <w:t xml:space="preserve">A Random Forest model was trained on historical station and weather data, serialised as a .pkl file, and integrated into the Flask backend via a prediction service that preloads the model at startup. The React frontend was updated to fetch and render predictions dynamically, with a brief cold-start latency on the first request acknowledged and documented. UI styling was refined for consistency across all pages. </w:t>
+        <w:t xml:space="preserve">A </w:t>
       </w:r>
       <w:r>
         <w:rPr>
@@ -1497,8 +1723,78 @@
           <w:sz w:val="22"/>
           <w:szCs w:val="22"/>
         </w:rPr>
+        <w:t>Decision Tree</w:t>
+      </w:r>
+      <w:r>
+        <w:rPr>
+          <w:rFonts w:ascii="Times New Roman" w:eastAsia="Arial" w:hAnsi="Times New Roman" w:cs="Times New Roman"/>
+          <w:sz w:val="22"/>
+          <w:szCs w:val="22"/>
+        </w:rPr>
+        <w:t xml:space="preserve"> model was trained on historical station and weather data, </w:t>
+      </w:r>
+      <w:proofErr w:type="spellStart"/>
+      <w:r>
+        <w:rPr>
+          <w:rFonts w:ascii="Times New Roman" w:eastAsia="Arial" w:hAnsi="Times New Roman" w:cs="Times New Roman"/>
+          <w:sz w:val="22"/>
+          <w:szCs w:val="22"/>
+        </w:rPr>
+        <w:t>serialised</w:t>
+      </w:r>
+      <w:proofErr w:type="spellEnd"/>
+      <w:r>
+        <w:rPr>
+          <w:rFonts w:ascii="Times New Roman" w:eastAsia="Arial" w:hAnsi="Times New Roman" w:cs="Times New Roman"/>
+          <w:sz w:val="22"/>
+          <w:szCs w:val="22"/>
+        </w:rPr>
+        <w:t xml:space="preserve"> as a .</w:t>
+      </w:r>
+      <w:proofErr w:type="spellStart"/>
+      <w:r>
+        <w:rPr>
+          <w:rFonts w:ascii="Times New Roman" w:eastAsia="Arial" w:hAnsi="Times New Roman" w:cs="Times New Roman"/>
+          <w:sz w:val="22"/>
+          <w:szCs w:val="22"/>
+        </w:rPr>
+        <w:t>pkl</w:t>
+      </w:r>
+      <w:proofErr w:type="spellEnd"/>
+      <w:r>
+        <w:rPr>
+          <w:rFonts w:ascii="Times New Roman" w:eastAsia="Arial" w:hAnsi="Times New Roman" w:cs="Times New Roman"/>
+          <w:sz w:val="22"/>
+          <w:szCs w:val="22"/>
+        </w:rPr>
+        <w:t xml:space="preserve"> file, and integrated into the Flask backend via a prediction service that preloads the model at startup. The React frontend was updated to fetch and render predictions dynamically, with a brief cold-start latency on the first request acknowledged and documented. UI styling was refined for consistency across all pages. </w:t>
+      </w:r>
+      <w:r>
+        <w:rPr>
+          <w:rFonts w:ascii="Times New Roman" w:eastAsia="Arial" w:hAnsi="Times New Roman" w:cs="Times New Roman"/>
+          <w:sz w:val="22"/>
+          <w:szCs w:val="22"/>
+        </w:rPr>
         <w:lastRenderedPageBreak/>
-        <w:t>Backend test coverage reached 97% with pytest, and the CI/CD pipeline was updated to download ML artefacts from Hugging Face Hub during the build stage.</w:t>
+        <w:t xml:space="preserve">Backend test coverage reached 97% with </w:t>
+      </w:r>
+      <w:proofErr w:type="spellStart"/>
+      <w:r>
+        <w:rPr>
+          <w:rFonts w:ascii="Times New Roman" w:eastAsia="Arial" w:hAnsi="Times New Roman" w:cs="Times New Roman"/>
+          <w:sz w:val="22"/>
+          <w:szCs w:val="22"/>
+        </w:rPr>
+        <w:t>pytest</w:t>
+      </w:r>
+      <w:proofErr w:type="spellEnd"/>
+      <w:r>
+        <w:rPr>
+          <w:rFonts w:ascii="Times New Roman" w:eastAsia="Arial" w:hAnsi="Times New Roman" w:cs="Times New Roman"/>
+          <w:sz w:val="22"/>
+          <w:szCs w:val="22"/>
+        </w:rPr>
+        <w:t>, and the CI/CD pipeline was updated to download ML artefacts from Hugging Face Hub during the build stage.</w:t>
       </w:r>
     </w:p>
     <w:bookmarkEnd w:id="3"/>
@@ -1513,7 +1809,7 @@
     </w:p>
     <w:p>
       <w:pPr>
-        <w:pStyle w:val="Heading3"/>
+        <w:pStyle w:val="3"/>
         <w:rPr>
           <w:rFonts w:ascii="Times New Roman" w:hAnsi="Times New Roman" w:cs="Times New Roman"/>
         </w:rPr>
@@ -1527,7 +1823,7 @@
     </w:p>
     <w:p>
       <w:pPr>
-        <w:pStyle w:val="Heading3"/>
+        <w:pStyle w:val="3"/>
         <w:rPr>
           <w:rFonts w:ascii="Times New Roman" w:hAnsi="Times New Roman" w:cs="Times New Roman"/>
         </w:rPr>
@@ -1613,7 +1909,7 @@
     </w:p>
     <w:p>
       <w:pPr>
-        <w:pStyle w:val="Heading3"/>
+        <w:pStyle w:val="3"/>
         <w:rPr>
           <w:rFonts w:ascii="Times New Roman" w:hAnsi="Times New Roman" w:cs="Times New Roman"/>
         </w:rPr>
@@ -1719,8 +2015,20 @@
           <w:szCs w:val="22"/>
           <w:highlight w:val="white"/>
         </w:rPr>
-        <w:t>.pkl</w:t>
-      </w:r>
+        <w:t>.</w:t>
+      </w:r>
+      <w:proofErr w:type="spellStart"/>
+      <w:r>
+        <w:rPr>
+          <w:rFonts w:ascii="Times New Roman" w:eastAsia="Roboto Mono" w:hAnsi="Times New Roman" w:cs="Times New Roman"/>
+          <w:color w:val="188038"/>
+          <w:sz w:val="22"/>
+          <w:szCs w:val="22"/>
+          <w:highlight w:val="white"/>
+        </w:rPr>
+        <w:t>pkl</w:t>
+      </w:r>
+      <w:proofErr w:type="spellEnd"/>
       <w:proofErr w:type="gramEnd"/>
       <w:r>
         <w:rPr>
@@ -2769,11 +3077,11 @@
     <w:lsdException w:name="Unresolved Mention" w:semiHidden="1" w:unhideWhenUsed="1"/>
     <w:lsdException w:name="Smart Link" w:semiHidden="1" w:unhideWhenUsed="1"/>
   </w:latentStyles>
-  <w:style w:type="paragraph" w:default="1" w:styleId="Normal">
+  <w:style w:type="paragraph" w:default="1" w:styleId="a">
     <w:name w:val="Normal"/>
     <w:qFormat/>
   </w:style>
-  <w:style w:type="paragraph" w:styleId="Heading1">
+  <w:style w:type="paragraph" w:styleId="1">
     <w:name w:val="heading 1"/>
     <w:uiPriority w:val="9"/>
     <w:qFormat/>
@@ -2789,7 +3097,7 @@
       <w:szCs w:val="32"/>
     </w:rPr>
   </w:style>
-  <w:style w:type="paragraph" w:styleId="Heading2">
+  <w:style w:type="paragraph" w:styleId="2">
     <w:name w:val="heading 2"/>
     <w:uiPriority w:val="9"/>
     <w:unhideWhenUsed/>
@@ -2806,7 +3114,7 @@
       <w:szCs w:val="26"/>
     </w:rPr>
   </w:style>
-  <w:style w:type="paragraph" w:styleId="Heading3">
+  <w:style w:type="paragraph" w:styleId="3">
     <w:name w:val="heading 3"/>
     <w:uiPriority w:val="9"/>
     <w:unhideWhenUsed/>
@@ -2823,7 +3131,7 @@
       <w:szCs w:val="22"/>
     </w:rPr>
   </w:style>
-  <w:style w:type="paragraph" w:styleId="Heading4">
+  <w:style w:type="paragraph" w:styleId="4">
     <w:name w:val="heading 4"/>
     <w:uiPriority w:val="9"/>
     <w:semiHidden/>
@@ -2838,7 +3146,7 @@
       <w:color w:val="2E74B5"/>
     </w:rPr>
   </w:style>
-  <w:style w:type="paragraph" w:styleId="Heading5">
+  <w:style w:type="paragraph" w:styleId="5">
     <w:name w:val="heading 5"/>
     <w:uiPriority w:val="9"/>
     <w:semiHidden/>
@@ -2851,7 +3159,7 @@
       <w:color w:val="2E74B5"/>
     </w:rPr>
   </w:style>
-  <w:style w:type="paragraph" w:styleId="Heading6">
+  <w:style w:type="paragraph" w:styleId="6">
     <w:name w:val="heading 6"/>
     <w:uiPriority w:val="9"/>
     <w:semiHidden/>
@@ -2864,13 +3172,12 @@
       <w:color w:val="1F4D78"/>
     </w:rPr>
   </w:style>
-  <w:style w:type="character" w:default="1" w:styleId="DefaultParagraphFont">
+  <w:style w:type="character" w:default="1" w:styleId="a0">
     <w:name w:val="Default Paragraph Font"/>
     <w:uiPriority w:val="1"/>
-    <w:semiHidden/>
     <w:unhideWhenUsed/>
   </w:style>
-  <w:style w:type="table" w:default="1" w:styleId="TableNormal">
+  <w:style w:type="table" w:default="1" w:styleId="a1">
     <w:name w:val="Normal Table"/>
     <w:uiPriority w:val="99"/>
     <w:semiHidden/>
@@ -2885,13 +3192,13 @@
       </w:tblCellMar>
     </w:tblPr>
   </w:style>
-  <w:style w:type="numbering" w:default="1" w:styleId="NoList">
+  <w:style w:type="numbering" w:default="1" w:styleId="a2">
     <w:name w:val="No List"/>
     <w:uiPriority w:val="99"/>
     <w:semiHidden/>
     <w:unhideWhenUsed/>
   </w:style>
-  <w:style w:type="paragraph" w:styleId="Title">
+  <w:style w:type="paragraph" w:styleId="a3">
     <w:name w:val="Title"/>
     <w:uiPriority w:val="10"/>
     <w:qFormat/>
@@ -2908,11 +3215,11 @@
       <w:bCs/>
     </w:rPr>
   </w:style>
-  <w:style w:type="paragraph" w:styleId="ListParagraph">
+  <w:style w:type="paragraph" w:styleId="a4">
     <w:name w:val="List Paragraph"/>
     <w:qFormat/>
   </w:style>
-  <w:style w:type="character" w:styleId="Hyperlink">
+  <w:style w:type="character" w:styleId="a5">
     <w:name w:val="Hyperlink"/>
     <w:uiPriority w:val="99"/>
     <w:unhideWhenUsed/>
@@ -2921,7 +3228,7 @@
       <w:u w:val="single"/>
     </w:rPr>
   </w:style>
-  <w:style w:type="character" w:styleId="FootnoteReference">
+  <w:style w:type="character" w:styleId="a6">
     <w:name w:val="footnote reference"/>
     <w:uiPriority w:val="99"/>
     <w:semiHidden/>
@@ -2930,16 +3237,16 @@
       <w:vertAlign w:val="superscript"/>
     </w:rPr>
   </w:style>
-  <w:style w:type="paragraph" w:styleId="FootnoteText">
+  <w:style w:type="paragraph" w:styleId="a7">
     <w:name w:val="footnote text"/>
-    <w:link w:val="FootnoteTextChar"/>
+    <w:link w:val="a8"/>
     <w:uiPriority w:val="99"/>
     <w:semiHidden/>
     <w:unhideWhenUsed/>
   </w:style>
-  <w:style w:type="character" w:customStyle="1" w:styleId="FootnoteTextChar">
-    <w:name w:val="Footnote Text Char"/>
-    <w:link w:val="FootnoteText"/>
+  <w:style w:type="character" w:customStyle="1" w:styleId="a8">
+    <w:name w:val="註腳文字 字元"/>
+    <w:link w:val="a7"/>
     <w:uiPriority w:val="99"/>
     <w:semiHidden/>
     <w:unhideWhenUsed/>
@@ -2948,7 +3255,7 @@
       <w:szCs w:val="20"/>
     </w:rPr>
   </w:style>
-  <w:style w:type="character" w:styleId="EndnoteReference">
+  <w:style w:type="character" w:styleId="a9">
     <w:name w:val="endnote reference"/>
     <w:uiPriority w:val="99"/>
     <w:semiHidden/>
@@ -2957,16 +3264,16 @@
       <w:vertAlign w:val="superscript"/>
     </w:rPr>
   </w:style>
-  <w:style w:type="paragraph" w:styleId="EndnoteText">
+  <w:style w:type="paragraph" w:styleId="aa">
     <w:name w:val="endnote text"/>
-    <w:link w:val="EndnoteTextChar"/>
+    <w:link w:val="ab"/>
     <w:uiPriority w:val="99"/>
     <w:semiHidden/>
     <w:unhideWhenUsed/>
   </w:style>
-  <w:style w:type="character" w:customStyle="1" w:styleId="EndnoteTextChar">
-    <w:name w:val="Endnote Text Char"/>
-    <w:link w:val="EndnoteText"/>
+  <w:style w:type="character" w:customStyle="1" w:styleId="ab">
+    <w:name w:val="章節附註文字 字元"/>
+    <w:link w:val="aa"/>
     <w:uiPriority w:val="99"/>
     <w:semiHidden/>
     <w:unhideWhenUsed/>

</xml_diff>